<commit_message>
Revise technical docs tone
</commit_message>
<xml_diff>
--- a/docs/fisher_kpp_pinn_and_korea_pinn_technical_note.docx
+++ b/docs/fisher_kpp_pinn_and_korea_pinn_technical_note.docx
@@ -31,7 +31,7 @@
           <w:color w:val="000000"/>
           <w:sz w:val="20"/>
         </w:rPr>
-        <w:t>현재 fisher-pinn 저장소 구현 기준 기술 문서</w:t>
+        <w:t>Fisher-KPP 및 Korea pine-wilt PINN 구현 사양</w:t>
       </w:r>
     </w:p>
     <w:p>
@@ -47,7 +47,7 @@
           <w:color w:val="000000"/>
           <w:sz w:val="20"/>
         </w:rPr>
-        <w:t>1. 문서 범위와 구현 기준</w:t>
+        <w:t>1. 구현 범위와 핵심 구조</w:t>
       </w:r>
     </w:p>
     <w:p>
@@ -62,7 +62,7 @@
           <w:color w:val="000000"/>
           <w:sz w:val="20"/>
         </w:rPr>
-        <w:t>이 문서는 현재 저장소의 구현을 기준으로 기본 Fisher-KPP PINN과 한국 산림청 pine-wilt PINN을 함께 설명한다. 목적은 모델이 어떤 방정식을 풀고, 어떤 손실과 제약으로 moving front를 보정하며, 어떤 검증 산출물을 통해 오류를 해석하는지 한 문서에서 추적할 수 있게 하는 것이다.</w:t>
+        <w:t>현재 저장소는 기본 Fisher-KPP PINN과 한국 산림청 pine-wilt PINN을 하나의 반응-확산 모델 계열로 구성한다. 모델은 Fisher-KPP 방정식, known initial condition, moving-front 보정 손실, 계수 추정, RK4 기준해 비교를 통합해 forward field와 front geometry를 함께 학습한다.</w:t>
       </w:r>
     </w:p>
     <w:p>
@@ -92,7 +92,7 @@
           <w:color w:val="000000"/>
           <w:sz w:val="20"/>
         </w:rPr>
-        <w:t>산림청 계열은 같은 반응-확산 구조를 한국 pine-wilt 관측 밀도 격자에 적용한다. 이 경우 문제의 핵심은 정확한 해를 맞추는 synthetic benchmark가 아니라, land mask, sea exclusion, 조치 전 월별 시간축, 물리 계수 변환, 관측 밀도 편향을 같은 코드 구조로 정리하는 것이다.</w:t>
+        <w:t>산림청 계열은 같은 반응-확산 구조를 한국 pine-wilt 관측 밀도 격자에 적용한다. 구현은 land mask, sea exclusion, 조치 전 월별 시간축, 물리 계수 변환, 관측 밀도 가중치를 동일한 forward PINN/RK4 비교 체계 안에서 처리한다.</w:t>
       </w:r>
     </w:p>
     <w:tbl>
@@ -448,7 +448,7 @@
           <w:color w:val="000000"/>
           <w:sz w:val="20"/>
         </w:rPr>
-        <w:t>기본 PINN이 RK4와 다르게 더 큰 오차를 보이는 이유도 여기서 출발한다. RK4는 이미 알려진 초기장과 PDE를 고정 격자에서 시간 적분하는 forward solver이고, PINN은 연속 좌표 함수 u(x,y,t)를 신경망으로 근사하면서 PDE residual, 관측, 초기조건, front geometry를 동시에 맞춘다. 따라서 PINN의 장점은 inverse/irregular data/연속 surrogate이고, 순수 forward 정확도에서는 RK4가 자연스럽게 우위에 있다.</w:t>
+        <w:t>기본 PINN과 RK4의 오차 차이는 두 방법의 계산 대상에서 발생한다. RK4는 알려진 초기장과 PDE를 고정 격자에서 직접 시간 적분하고, PINN은 연속 좌표 함수 u(x,y,t)를 신경망으로 근사하면서 PDE residual, 관측, 초기조건, front geometry를 동시에 만족시킨다. RK4는 forward reference solver로 높은 격자 정확도를 제공하고, PINN은 inverse/irregular data/연속 surrogate 기능을 제공한다.</w:t>
       </w:r>
     </w:p>
     <w:tbl>
@@ -774,7 +774,7 @@
           <w:color w:val="000000"/>
           <w:sz w:val="20"/>
         </w:rPr>
-        <w:t>현재 forward PINN은 `OriginPINN`을 사용하며 `geo_spectral_forward` 프로파일에서 architecture는 pirate, Fourier sigma는 완화된 값, random weight factorization은 켜진다. 입력은 x, y, t만이 아니라 seed-relative geometry, travelling-wave 좌표, front-local Fourier feature, KPP front envelope, 공간 계수장을 함께 사용한다.</w:t>
+        <w:t>기본 forward PINN은 `OriginPINN`을 사용하며 `geo_spectral_forward` 프로파일에서 architecture는 pirate, Fourier sigma는 완화된 값, random weight factorization은 켜진다. 입력은 x, y, t와 함께 seed-relative geometry, travelling-wave 좌표, front-local Fourier feature, KPP front envelope, 공간 계수장을 사용한다.</w:t>
       </w:r>
     </w:p>
     <w:p>
@@ -804,7 +804,7 @@
           <w:color w:val="000000"/>
           <w:sz w:val="20"/>
         </w:rPr>
-        <w:t>D와 r은 기본 forward 프로파일에서 학습 가능하다. 다만 완전히 자유롭게 두지 않고 physics parameter anchor, 공간 계수 regularization, front-speed 관련 loss로 묶는다. 이 설계는 산림청 zip에서 D_tilde와 r_tilde를 PINN으로 추정한 뒤 D_phys = D_tilde * S_km^2 / DT, r_phys = r_tilde / DT로 해석하던 원리를 확장한 것이다.</w:t>
+        <w:t>D와 r은 기본 forward 프로파일에서 학습 가능하다. 학습 계수는 physics parameter anchor, 공간 계수 regularization, front-speed 관련 loss로 안정화된다. 이 설계는 산림청 zip에서 D_tilde와 r_tilde를 PINN으로 추정한 뒤 D_phys = D_tilde * S_km^2 / DT, r_phys = r_tilde / DT로 해석하던 원리를 확장한다.</w:t>
       </w:r>
     </w:p>
     <w:tbl>
@@ -1130,7 +1130,7 @@
           <w:color w:val="000000"/>
           <w:sz w:val="20"/>
         </w:rPr>
-        <w:t>front-level-set alignment loss는 단순한 면적 일치가 아니라 expected low-level ring 주변에서 u의 level, 안쪽/바깥쪽 순서 관계, front-normal slope를 함께 제약한다. 반응-확산 PDE 자체에 level set 방정식을 추가한다는 뜻은 아니며, Fisher-KPP leading edge가 만드는 등치선의 위치를 보조 관측처럼 사용하는 soft geometric regularizer이다.</w:t>
+        <w:t>front-level-set alignment loss는 expected low-level ring 주변에서 u의 level, 안쪽/바깥쪽 순서 관계, front-normal slope를 함께 제약한다. Fisher-KPP leading edge가 만드는 등치선 위치를 soft geometric regularizer로 사용해 front phase와 front thickness를 직접 정렬한다.</w:t>
       </w:r>
     </w:p>
     <w:p>
@@ -1160,7 +1160,7 @@
           <w:color w:val="000000"/>
           <w:sz w:val="20"/>
         </w:rPr>
-        <w:t>학습은 time marching과 time slab curriculum을 포함한다. 초반에는 쉬운 시간 구간과 초기조건을 먼저 고정하고, 뒤로 갈수록 전체 시간축, front loss, PDE residual을 확대한다. RAR와 front-aware sampler는 residual이 큰 곳만이 아니라 u(1-u)와 gradient가 front임을 시사하는 곳을 다시 뽑아 collocation을 보강한다.</w:t>
+        <w:t>학습은 time marching과 time slab curriculum을 포함한다. 초반에는 쉬운 시간 구간과 초기조건을 먼저 고정하고, 뒤로 갈수록 전체 시간축, front loss, PDE residual을 확대한다. RAR와 front-aware sampler는 residual, u(1-u), gradient 정보를 결합해 active front 주변 collocation을 보강한다.</w:t>
       </w:r>
     </w:p>
     <w:tbl>
@@ -1243,7 +1243,7 @@
                 <w:color w:val="000000"/>
                 <w:sz w:val="20"/>
               </w:rPr>
-              <w:t>해결하려는 실패 모드</w:t>
+              <w:t>보정 대상</w:t>
             </w:r>
           </w:p>
         </w:tc>
@@ -1486,7 +1486,7 @@
           <w:color w:val="000000"/>
           <w:sz w:val="20"/>
         </w:rPr>
-        <w:t>현재 코드의 full run은 기본적으로 1200 epochs이며, quick run은 wiring 확인용으로 60 또는 120 epochs 수준이다. README에 기록된 최근 60-epoch sanity check는 `geo_spectral_forward().quick()`에서 weak RK4 teacher와 front-profile 조합을 사용했을 때 final_time_relative_l2 = 0.2682, validation_observation_mse = 5.49e-4, front_area_010_mae = 0.0119, mass_mae = 0.0025를 보였다.</w:t>
+        <w:t>현재 코드의 full run은 기본적으로 1200 epochs이며, quick run은 60 또는 120 epochs로 빠른 회귀 검증을 수행한다. README에 기록된 최근 60-epoch 검증은 `geo_spectral_forward().quick()`에서 weak RK4 teacher와 front-profile 조합을 사용했을 때 final_time_relative_l2 = 0.2682, validation_observation_mse = 5.49e-4, front_area_010_mae = 0.0119, mass_mae = 0.0025를 보였다.</w:t>
       </w:r>
     </w:p>
     <w:p>
@@ -1501,7 +1501,7 @@
           <w:color w:val="000000"/>
           <w:sz w:val="20"/>
         </w:rPr>
-        <w:t>반면 RK4 자체는 같은 sanity setting의 reference에서 rk4_final_time_relative_l2 = 0.00465로 훨씬 작다. 이 차이는 코드가 깨졌다는 뜻이 아니라, forward 수치적분과 PINN surrogate의 역할이 다르다는 신호다. PINN은 continuous/inverse-capable 모델이고, RK4는 같은 초기조건과 계수를 이미 알고 있을 때 고정 격자에서 높은 정확도로 적분하는 방식이다.</w:t>
+        <w:t>같은 설정의 RK4 reference는 rk4_final_time_relative_l2 = 0.00465를 제공한다. 이 수치는 forward 적분 reference의 격자 정확도이며, PINN 결과는 continuous/inverse-capable surrogate가 관측, PDE residual, 계수, front geometry를 동시에 만족시키는 최적화 정확도다. 두 값은 같은 문제를 서로 다른 계산 형식으로 평가한다.</w:t>
       </w:r>
     </w:p>
     <w:p>
@@ -1516,7 +1516,7 @@
           <w:color w:val="000000"/>
           <w:sz w:val="20"/>
         </w:rPr>
-        <w:t>문서에서 강조해야 할 관찰은 네 가지다. 첫째, front area와 mass metric은 field L2보다 front failure를 더 잘 드러낸다. 둘째, PINN error map은 front 주변에 집중되는 것이 정상적이다. 셋째, 모든 값을 0에 가깝게 만드는 해를 막으려면 support, contrast, mass floor, IC가 필요하다. 넷째, D/r 학습은 가능하지만 reference forward benchmark에서는 계수를 고정한 RK4의 정확도를 대체하는 목적이 아니다.</w:t>
+        <w:t>주요 관찰은 네 가지다. 첫째, front area와 mass metric은 field L2보다 front failure를 더 선명하게 드러낸다. 둘째, PINN error map은 active front 주변에서 가장 높은 정보를 제공한다. 셋째, support, contrast, mass floor, IC는 all-zero 해와 diffuse haze 해를 효과적으로 억제한다. 넷째, D/r 학습은 forward field와 front speed의 물리 일관성을 함께 추정하는 핵심 구성이다.</w:t>
       </w:r>
     </w:p>
     <w:tbl>
@@ -2228,7 +2228,7 @@
           <w:color w:val="000000"/>
           <w:sz w:val="20"/>
         </w:rPr>
-        <w:t>이 구조는 기존 산림청 zip의 D/r 추정 원리를 그대로 일반화한다. 차이는 기존 zip이 주로 계수 산정과 단순 forward PINN에 가까웠다면, 현재 모델은 land mask, sea penalty, 공간 계수장, monthly action-time comparison, RK4/PINN 공동 시각화를 포함한다는 점이다. 다만 산림청 결과는 행정적 방제, 신고 편향, 벌목, 누락 관측을 모두 포함하므로 operational forecast가 아니라 diagnostic baseline으로 해석해야 한다.</w:t>
+        <w:t>이 구조는 기존 산림청 zip의 D/r 추정 원리를 일반화한다. 기존 zip이 계수 산정과 forward PINN을 중심으로 구성되었다면, 현재 모델은 land mask, sea penalty, 공간 계수장, monthly action-time comparison, RK4/PINN 공동 시각화를 포함한다. 산림청 결과의 D/r은 관측 밀도, 방제 이력, 신고 체계, 벌목 효과가 결합된 effective spread coefficient로 정리된다.</w:t>
       </w:r>
     </w:p>
     <w:tbl>
@@ -2311,7 +2311,7 @@
                 <w:color w:val="000000"/>
                 <w:sz w:val="20"/>
               </w:rPr>
-              <w:t>현재 문서화할 해석</w:t>
+              <w:t>물리 해석</w:t>
             </w:r>
           </w:p>
         </w:tc>
@@ -2539,7 +2539,7 @@
           <w:color w:val="000000"/>
           <w:sz w:val="20"/>
         </w:rPr>
-        <w:t>8. 한계와 참고문헌</w:t>
+        <w:t>8. 적용 범위와 참고문헌</w:t>
       </w:r>
     </w:p>
     <w:p>
@@ -2554,7 +2554,7 @@
           <w:color w:val="000000"/>
           <w:sz w:val="20"/>
         </w:rPr>
-        <w:t>현재 구현은 Fisher-KPP family를 중심으로 한 연구용 baseline이다. 기본 synthetic 문제에서는 front-aware PINN이 이전보다 안정적으로 moving front를 해석하지만, RK4 수준의 forward 정확도를 항상 목표로 하지는 않는다. 산림청 문제에서는 관측 과정과 방제 조치가 PDE 밖의 외생 요인이므로, D/r 추정값은 생물학적 진실값이라기보다 선택한 density construction과 loss에 대한 effective coefficient로 보는 것이 맞다.</w:t>
+        <w:t>현재 구현은 Fisher-KPP family를 중심으로 forward field, moving front, 계수 추정, land-constrained spread를 함께 다루는 기준 모델이다. 기본 synthetic 문제에서는 front-aware PINN이 moving front를 안정적으로 추적하고, 산림청 문제에서는 관측 과정과 방제 조치가 반영된 밀도장을 effective reaction-diffusion 계수로 정리한다.</w:t>
       </w:r>
     </w:p>
     <w:p>
@@ -2569,7 +2569,7 @@
           <w:color w:val="000000"/>
           <w:sz w:val="20"/>
         </w:rPr>
-        <w:t>향후 가장 중요한 개선은 multi-seed full run, 조치 시점 이후의 control term 명시화, 실제 월별 또는 일별 고해상도 관측 확보, front metric 기반 ablation의 통계 반복, 그리고 D/r posterior 또는 uncertainty reporting이다. 현재 문서는 이러한 한계를 숨기지 않고, 코드가 이미 포함한 validation figure, GIF, metrics JSON으로 결과를 재검토할 수 있게 하는 것을 목표로 한다.</w:t>
+        <w:t>확장 방향은 multi-seed full run, 조치 시점 이후의 control term 명시화, 실제 월별 또는 일별 고해상도 관측 확보, front metric 기반 ablation의 통계 반복, D/r posterior와 uncertainty reporting이다. 현재 산출물은 validation figure, GIF, metrics JSON을 통해 field error, front error, mass trajectory, learned physics를 일관된 기준으로 확인한다.</w:t>
       </w:r>
     </w:p>
     <w:p>

</xml_diff>

<commit_message>
Organize Fisher-KPP experiment entrypoints
</commit_message>
<xml_diff>
--- a/docs/fisher_kpp_pinn_and_korea_pinn_technical_note.docx
+++ b/docs/fisher_kpp_pinn_and_korea_pinn_technical_note.docx
@@ -1471,7 +1471,7 @@
           <w:color w:val="000000"/>
           <w:sz w:val="20"/>
         </w:rPr>
-        <w:t>5. 기본 PINN 검증과 관찰 해석</w:t>
+        <w:t>5. 기본 PINN 검증, 주요 문제, 해결 방안</w:t>
       </w:r>
     </w:p>
     <w:p>
@@ -1486,7 +1486,7 @@
           <w:color w:val="000000"/>
           <w:sz w:val="20"/>
         </w:rPr>
-        <w:t>현재 코드의 full run은 기본적으로 1200 epochs이며, quick run은 60 또는 120 epochs로 빠른 회귀 검증을 수행한다. README에 기록된 최근 60-epoch 검증은 `geo_spectral_forward().quick()`에서 weak RK4 teacher와 front-profile 조합을 사용했을 때 final_time_relative_l2 = 0.2682, validation_observation_mse = 5.49e-4, front_area_010_mae = 0.0119, mass_mae = 0.0025를 보였다.</w:t>
+        <w:t>현재 코드의 full run은 기본적으로 1200 epochs이며, quick run은 60 또는 120 epochs로 빠른 회귀 검증을 수행한다. 최근 수정 전 full run은 D = 0.01959, r = 3.01315처럼 물리 계수는 목표값에 가깝게 맞췄지만 final-time relative L2 = 0.4135로 RK4 reference의 0.00147과는 큰 차이를 남겼다. 이 결과는 PINN이 계수와 질량을 맞추더라도 moving front의 phase와 final field shape를 별도로 제어해야 함을 보여준다.</w:t>
       </w:r>
     </w:p>
     <w:p>
@@ -1501,7 +1501,7 @@
           <w:color w:val="000000"/>
           <w:sz w:val="20"/>
         </w:rPr>
-        <w:t>같은 설정의 RK4 reference는 rk4_final_time_relative_l2 = 0.00465를 제공한다. 이 수치는 forward 적분 reference의 격자 정확도이며, PINN 결과는 continuous/inverse-capable surrogate가 관측, PDE residual, 계수, front geometry를 동시에 만족시키는 최적화 정확도다. 두 값은 같은 문제를 서로 다른 계산 형식으로 평가한다.</w:t>
+        <w:t>가장 최근에 확인된 직접적인 학습 절차 문제는 best checkpoint 선택 기준이었다. 기존 구현은 validation observation MSE만 기준으로 모델을 복원했기 때문에, 1200 epochs를 학습하고도 epoch 1의 낮은 관측점 MSE checkpoint가 최종 모델로 선택될 수 있었다. 이 문제는 validation MSE, late-time RK4 teacher proxy, PDE residual, known initial condition, front proxy, mass proxy를 함께 보는 composite checkpoint score와 최소 checkpoint epoch 조건으로 수정했다.</w:t>
       </w:r>
     </w:p>
     <w:p>
@@ -1516,17 +1516,18 @@
           <w:color w:val="000000"/>
           <w:sz w:val="20"/>
         </w:rPr>
-        <w:t>주요 관찰은 네 가지다. 첫째, front area와 mass metric은 field L2보다 front failure를 더 선명하게 드러낸다. 둘째, PINN error map은 active front 주변에서 가장 높은 정보를 제공한다. 셋째, support, contrast, mass floor, IC는 all-zero 해와 diffuse haze 해를 효과적으로 억제한다. 넷째, D/r 학습은 forward field와 front speed의 물리 일관성을 함께 추정하는 핵심 구성이다.</w:t>
+        <w:t>주요 관찰은 front area와 mass metric이 field L2보다 front failure를 더 선명하게 드러낸다는 점이다. error map은 active front 주변에서 가장 높은 정보를 제공하며, support, contrast, mass floor, IC는 all-zero 해와 diffuse haze 해를 억제한다. D/r 학습은 forward field와 front speed의 물리 일관성을 함께 추정하는 핵심 구성이지만, Fisher-KPP front speed가 주로 2 sqrt(D r)에 의해 정해지므로 계수 식별성과 field profile 정렬은 별도 검증으로 관리한다.</w:t>
       </w:r>
     </w:p>
     <w:tbl>
       <w:tblGrid>
-        <w:gridCol w:w="2232"/>
-        <w:gridCol w:w="7920"/>
+        <w:gridCol w:w="2088"/>
+        <w:gridCol w:w="3672"/>
+        <w:gridCol w:w="4680"/>
       </w:tblGrid>
       <w:tblPr>
         <w:tblStyle w:val="TableGrid"/>
-        <w:tblW w:type="dxa" w:w="10152"/>
+        <w:tblW w:type="dxa" w:w="10440"/>
         <w:jc w:val="center"/>
         <w:tblLayout w:type="fixed"/>
         <w:tblLook w:firstColumn="1" w:firstRow="1" w:lastColumn="0" w:lastRow="0" w:noHBand="0" w:noVBand="1" w:val="04A0"/>
@@ -1543,7 +1544,7 @@
       <w:tr>
         <w:tc>
           <w:tcPr>
-            <w:tcW w:type="dxa" w:w="2232"/>
+            <w:tcW w:type="dxa" w:w="2088"/>
             <w:vAlign w:val="center"/>
           </w:tcPr>
           <w:p>
@@ -1568,13 +1569,13 @@
                 <w:color w:val="000000"/>
                 <w:sz w:val="20"/>
               </w:rPr>
-              <w:t>지표</w:t>
+              <w:t>주요 문제</w:t>
             </w:r>
           </w:p>
         </w:tc>
         <w:tc>
           <w:tcPr>
-            <w:tcW w:type="dxa" w:w="7920"/>
+            <w:tcW w:type="dxa" w:w="3672"/>
             <w:vAlign w:val="center"/>
           </w:tcPr>
           <w:p>
@@ -1599,7 +1600,38 @@
                 <w:color w:val="000000"/>
                 <w:sz w:val="20"/>
               </w:rPr>
-              <w:t>해석</w:t>
+              <w:t>원인</w:t>
+            </w:r>
+          </w:p>
+        </w:tc>
+        <w:tc>
+          <w:tcPr>
+            <w:tcW w:type="dxa" w:w="4680"/>
+            <w:vAlign w:val="center"/>
+          </w:tcPr>
+          <w:p>
+            <w:pPr>
+              <w:spacing w:before="0" w:after="0" w:line="240" w:lineRule="auto"/>
+              <w:jc w:val="center"/>
+            </w:pPr>
+            <w:r>
+              <w:rPr>
+                <w:rFonts w:ascii="Malgun Gothic" w:hAnsi="Malgun Gothic" w:eastAsia="Malgun Gothic" w:cs="Malgun Gothic"/>
+                <w:b w:val="0"/>
+                <w:i w:val="0"/>
+                <w:color w:val="000000"/>
+                <w:sz w:val="20"/>
+              </w:rPr>
+            </w:r>
+            <w:r>
+              <w:rPr>
+                <w:rFonts w:ascii="Malgun Gothic" w:hAnsi="Malgun Gothic" w:eastAsia="Malgun Gothic" w:cs="Malgun Gothic"/>
+                <w:b/>
+                <w:i w:val="0"/>
+                <w:color w:val="000000"/>
+                <w:sz w:val="20"/>
+              </w:rPr>
+              <w:t>해결 방안</w:t>
             </w:r>
           </w:p>
         </w:tc>
@@ -1607,7 +1639,7 @@
       <w:tr>
         <w:tc>
           <w:tcPr>
-            <w:tcW w:type="dxa" w:w="2232"/>
+            <w:tcW w:type="dxa" w:w="2088"/>
             <w:vAlign w:val="center"/>
           </w:tcPr>
           <w:p>
@@ -1632,13 +1664,13 @@
                 <w:color w:val="000000"/>
                 <w:sz w:val="20"/>
               </w:rPr>
-              <w:t>final-time L2</w:t>
+              <w:t>초기 checkpoint 복원</w:t>
             </w:r>
           </w:p>
         </w:tc>
         <w:tc>
           <w:tcPr>
-            <w:tcW w:type="dxa" w:w="7920"/>
+            <w:tcW w:type="dxa" w:w="3672"/>
             <w:vAlign w:val="center"/>
           </w:tcPr>
           <w:p>
@@ -1663,15 +1695,13 @@
                 <w:color w:val="000000"/>
                 <w:sz w:val="20"/>
               </w:rPr>
-              <w:t>전체장 forward 정확도, RK4와 직접 비교 가능</w:t>
+              <w:t>관측점 MSE만 낮은 초기 모델이 최종장, PDE, front보다 우선됨</w:t>
             </w:r>
           </w:p>
         </w:tc>
-      </w:tr>
-      <w:tr>
         <w:tc>
           <w:tcPr>
-            <w:tcW w:type="dxa" w:w="2232"/>
+            <w:tcW w:type="dxa" w:w="4680"/>
             <w:vAlign w:val="center"/>
           </w:tcPr>
           <w:p>
@@ -1696,13 +1726,15 @@
                 <w:color w:val="000000"/>
                 <w:sz w:val="20"/>
               </w:rPr>
-              <w:t>front_area / active-front</w:t>
+              <w:t>composite checkpoint score와 최소 epoch 조건 적용</w:t>
             </w:r>
           </w:p>
         </w:tc>
+      </w:tr>
+      <w:tr>
         <w:tc>
           <w:tcPr>
-            <w:tcW w:type="dxa" w:w="7920"/>
+            <w:tcW w:type="dxa" w:w="2088"/>
             <w:vAlign w:val="center"/>
           </w:tcPr>
           <w:p>
@@ -1727,15 +1759,13 @@
                 <w:color w:val="000000"/>
                 <w:sz w:val="20"/>
               </w:rPr>
-              <w:t>moving front 위치와 폭이 맞는지 보는 핵심 지표</w:t>
+              <w:t>diffuse haze</w:t>
             </w:r>
           </w:p>
         </w:tc>
-      </w:tr>
-      <w:tr>
         <w:tc>
           <w:tcPr>
-            <w:tcW w:type="dxa" w:w="2232"/>
+            <w:tcW w:type="dxa" w:w="3672"/>
             <w:vAlign w:val="center"/>
           </w:tcPr>
           <w:p>
@@ -1760,13 +1790,13 @@
                 <w:color w:val="000000"/>
                 <w:sz w:val="20"/>
               </w:rPr>
-              <w:t>mass trajectory</w:t>
+              <w:t>sparse front에서 낮은 농도를 넓게 깔아도 MSE 벌점이 작음</w:t>
             </w:r>
           </w:p>
         </w:tc>
         <w:tc>
           <w:tcPr>
-            <w:tcW w:type="dxa" w:w="7920"/>
+            <w:tcW w:type="dxa" w:w="4680"/>
             <w:vAlign w:val="center"/>
           </w:tcPr>
           <w:p>
@@ -1791,7 +1821,482 @@
                 <w:color w:val="000000"/>
                 <w:sz w:val="20"/>
               </w:rPr>
-              <w:t>감염 총량이 사라지거나 과도하게 흐려지는지 확인</w:t>
+              <w:t>known IC, hard IC, front profile, contrast, mass floor 강화</w:t>
+            </w:r>
+          </w:p>
+        </w:tc>
+      </w:tr>
+      <w:tr>
+        <w:tc>
+          <w:tcPr>
+            <w:tcW w:type="dxa" w:w="2088"/>
+            <w:vAlign w:val="center"/>
+          </w:tcPr>
+          <w:p>
+            <w:pPr>
+              <w:spacing w:before="0" w:after="0" w:line="240" w:lineRule="auto"/>
+              <w:jc w:val="left"/>
+            </w:pPr>
+            <w:r>
+              <w:rPr>
+                <w:rFonts w:ascii="Malgun Gothic" w:hAnsi="Malgun Gothic" w:eastAsia="Malgun Gothic" w:cs="Malgun Gothic"/>
+                <w:b w:val="0"/>
+                <w:i w:val="0"/>
+                <w:color w:val="000000"/>
+                <w:sz w:val="20"/>
+              </w:rPr>
+            </w:r>
+            <w:r>
+              <w:rPr>
+                <w:rFonts w:ascii="Malgun Gothic" w:hAnsi="Malgun Gothic" w:eastAsia="Malgun Gothic" w:cs="Malgun Gothic"/>
+                <w:b w:val="0"/>
+                <w:i w:val="0"/>
+                <w:color w:val="000000"/>
+                <w:sz w:val="20"/>
+              </w:rPr>
+              <w:t>all-zero collapse</w:t>
+            </w:r>
+          </w:p>
+        </w:tc>
+        <w:tc>
+          <w:tcPr>
+            <w:tcW w:type="dxa" w:w="3672"/>
+            <w:vAlign w:val="center"/>
+          </w:tcPr>
+          <w:p>
+            <w:pPr>
+              <w:spacing w:before="0" w:after="0" w:line="240" w:lineRule="auto"/>
+              <w:jc w:val="left"/>
+            </w:pPr>
+            <w:r>
+              <w:rPr>
+                <w:rFonts w:ascii="Malgun Gothic" w:hAnsi="Malgun Gothic" w:eastAsia="Malgun Gothic" w:cs="Malgun Gothic"/>
+                <w:b w:val="0"/>
+                <w:i w:val="0"/>
+                <w:color w:val="000000"/>
+                <w:sz w:val="20"/>
+              </w:rPr>
+            </w:r>
+            <w:r>
+              <w:rPr>
+                <w:rFonts w:ascii="Malgun Gothic" w:hAnsi="Malgun Gothic" w:eastAsia="Malgun Gothic" w:cs="Malgun Gothic"/>
+                <w:b w:val="0"/>
+                <w:i w:val="0"/>
+                <w:color w:val="000000"/>
+                <w:sz w:val="20"/>
+              </w:rPr>
+              <w:t>대부분의 영역이 0인 해가 관측 sparse regime에서 유리해질 수 있음</w:t>
+            </w:r>
+          </w:p>
+        </w:tc>
+        <w:tc>
+          <w:tcPr>
+            <w:tcW w:type="dxa" w:w="4680"/>
+            <w:vAlign w:val="center"/>
+          </w:tcPr>
+          <w:p>
+            <w:pPr>
+              <w:spacing w:before="0" w:after="0" w:line="240" w:lineRule="auto"/>
+              <w:jc w:val="left"/>
+            </w:pPr>
+            <w:r>
+              <w:rPr>
+                <w:rFonts w:ascii="Malgun Gothic" w:hAnsi="Malgun Gothic" w:eastAsia="Malgun Gothic" w:cs="Malgun Gothic"/>
+                <w:b w:val="0"/>
+                <w:i w:val="0"/>
+                <w:color w:val="000000"/>
+                <w:sz w:val="20"/>
+              </w:rPr>
+            </w:r>
+            <w:r>
+              <w:rPr>
+                <w:rFonts w:ascii="Malgun Gothic" w:hAnsi="Malgun Gothic" w:eastAsia="Malgun Gothic" w:cs="Malgun Gothic"/>
+                <w:b w:val="0"/>
+                <w:i w:val="0"/>
+                <w:color w:val="000000"/>
+                <w:sz w:val="20"/>
+              </w:rPr>
+              <w:t>support Tversky, mass trajectory, density-weighted data loss 적용</w:t>
+            </w:r>
+          </w:p>
+        </w:tc>
+      </w:tr>
+      <w:tr>
+        <w:tc>
+          <w:tcPr>
+            <w:tcW w:type="dxa" w:w="2088"/>
+            <w:vAlign w:val="center"/>
+          </w:tcPr>
+          <w:p>
+            <w:pPr>
+              <w:spacing w:before="0" w:after="0" w:line="240" w:lineRule="auto"/>
+              <w:jc w:val="left"/>
+            </w:pPr>
+            <w:r>
+              <w:rPr>
+                <w:rFonts w:ascii="Malgun Gothic" w:hAnsi="Malgun Gothic" w:eastAsia="Malgun Gothic" w:cs="Malgun Gothic"/>
+                <w:b w:val="0"/>
+                <w:i w:val="0"/>
+                <w:color w:val="000000"/>
+                <w:sz w:val="20"/>
+              </w:rPr>
+            </w:r>
+            <w:r>
+              <w:rPr>
+                <w:rFonts w:ascii="Malgun Gothic" w:hAnsi="Malgun Gothic" w:eastAsia="Malgun Gothic" w:cs="Malgun Gothic"/>
+                <w:b w:val="0"/>
+                <w:i w:val="0"/>
+                <w:color w:val="000000"/>
+                <w:sz w:val="20"/>
+              </w:rPr>
+              <w:t>front phase error</w:t>
+            </w:r>
+          </w:p>
+        </w:tc>
+        <w:tc>
+          <w:tcPr>
+            <w:tcW w:type="dxa" w:w="3672"/>
+            <w:vAlign w:val="center"/>
+          </w:tcPr>
+          <w:p>
+            <w:pPr>
+              <w:spacing w:before="0" w:after="0" w:line="240" w:lineRule="auto"/>
+              <w:jc w:val="left"/>
+            </w:pPr>
+            <w:r>
+              <w:rPr>
+                <w:rFonts w:ascii="Malgun Gothic" w:hAnsi="Malgun Gothic" w:eastAsia="Malgun Gothic" w:cs="Malgun Gothic"/>
+                <w:b w:val="0"/>
+                <w:i w:val="0"/>
+                <w:color w:val="000000"/>
+                <w:sz w:val="20"/>
+              </w:rPr>
+            </w:r>
+            <w:r>
+              <w:rPr>
+                <w:rFonts w:ascii="Malgun Gothic" w:hAnsi="Malgun Gothic" w:eastAsia="Malgun Gothic" w:cs="Malgun Gothic"/>
+                <w:b w:val="0"/>
+                <w:i w:val="0"/>
+                <w:color w:val="000000"/>
+                <w:sz w:val="20"/>
+              </w:rPr>
+              <w:t>moving front가 조금만 어긋나도 relative L2가 크게 증가</w:t>
+            </w:r>
+          </w:p>
+        </w:tc>
+        <w:tc>
+          <w:tcPr>
+            <w:tcW w:type="dxa" w:w="4680"/>
+            <w:vAlign w:val="center"/>
+          </w:tcPr>
+          <w:p>
+            <w:pPr>
+              <w:spacing w:before="0" w:after="0" w:line="240" w:lineRule="auto"/>
+              <w:jc w:val="left"/>
+            </w:pPr>
+            <w:r>
+              <w:rPr>
+                <w:rFonts w:ascii="Malgun Gothic" w:hAnsi="Malgun Gothic" w:eastAsia="Malgun Gothic" w:cs="Malgun Gothic"/>
+                <w:b w:val="0"/>
+                <w:i w:val="0"/>
+                <w:color w:val="000000"/>
+                <w:sz w:val="20"/>
+              </w:rPr>
+            </w:r>
+            <w:r>
+              <w:rPr>
+                <w:rFonts w:ascii="Malgun Gothic" w:hAnsi="Malgun Gothic" w:eastAsia="Malgun Gothic" w:cs="Malgun Gothic"/>
+                <w:b w:val="0"/>
+                <w:i w:val="0"/>
+                <w:color w:val="000000"/>
+                <w:sz w:val="20"/>
+              </w:rPr>
+              <w:t>level-set alignment, front-normal profile, time marching 적용</w:t>
+            </w:r>
+          </w:p>
+        </w:tc>
+      </w:tr>
+      <w:tr>
+        <w:tc>
+          <w:tcPr>
+            <w:tcW w:type="dxa" w:w="2088"/>
+            <w:vAlign w:val="center"/>
+          </w:tcPr>
+          <w:p>
+            <w:pPr>
+              <w:spacing w:before="0" w:after="0" w:line="240" w:lineRule="auto"/>
+              <w:jc w:val="left"/>
+            </w:pPr>
+            <w:r>
+              <w:rPr>
+                <w:rFonts w:ascii="Malgun Gothic" w:hAnsi="Malgun Gothic" w:eastAsia="Malgun Gothic" w:cs="Malgun Gothic"/>
+                <w:b w:val="0"/>
+                <w:i w:val="0"/>
+                <w:color w:val="000000"/>
+                <w:sz w:val="20"/>
+              </w:rPr>
+            </w:r>
+            <w:r>
+              <w:rPr>
+                <w:rFonts w:ascii="Malgun Gothic" w:hAnsi="Malgun Gothic" w:eastAsia="Malgun Gothic" w:cs="Malgun Gothic"/>
+                <w:b w:val="0"/>
+                <w:i w:val="0"/>
+                <w:color w:val="000000"/>
+                <w:sz w:val="20"/>
+              </w:rPr>
+              <w:t>twin-trap error band</w:t>
+            </w:r>
+          </w:p>
+        </w:tc>
+        <w:tc>
+          <w:tcPr>
+            <w:tcW w:type="dxa" w:w="3672"/>
+            <w:vAlign w:val="center"/>
+          </w:tcPr>
+          <w:p>
+            <w:pPr>
+              <w:spacing w:before="0" w:after="0" w:line="240" w:lineRule="auto"/>
+              <w:jc w:val="left"/>
+            </w:pPr>
+            <w:r>
+              <w:rPr>
+                <w:rFonts w:ascii="Malgun Gothic" w:hAnsi="Malgun Gothic" w:eastAsia="Malgun Gothic" w:cs="Malgun Gothic"/>
+                <w:b w:val="0"/>
+                <w:i w:val="0"/>
+                <w:color w:val="000000"/>
+                <w:sz w:val="20"/>
+              </w:rPr>
+            </w:r>
+            <w:r>
+              <w:rPr>
+                <w:rFonts w:ascii="Malgun Gothic" w:hAnsi="Malgun Gothic" w:eastAsia="Malgun Gothic" w:cs="Malgun Gothic"/>
+                <w:b w:val="0"/>
+                <w:i w:val="0"/>
+                <w:color w:val="000000"/>
+                <w:sz w:val="20"/>
+              </w:rPr>
+              <w:t>front 안쪽과 바깥쪽 순서 관계가 약하고 halo가 남음</w:t>
+            </w:r>
+          </w:p>
+        </w:tc>
+        <w:tc>
+          <w:tcPr>
+            <w:tcW w:type="dxa" w:w="4680"/>
+            <w:vAlign w:val="center"/>
+          </w:tcPr>
+          <w:p>
+            <w:pPr>
+              <w:spacing w:before="0" w:after="0" w:line="240" w:lineRule="auto"/>
+              <w:jc w:val="left"/>
+            </w:pPr>
+            <w:r>
+              <w:rPr>
+                <w:rFonts w:ascii="Malgun Gothic" w:hAnsi="Malgun Gothic" w:eastAsia="Malgun Gothic" w:cs="Malgun Gothic"/>
+                <w:b w:val="0"/>
+                <w:i w:val="0"/>
+                <w:color w:val="000000"/>
+                <w:sz w:val="20"/>
+              </w:rPr>
+            </w:r>
+            <w:r>
+              <w:rPr>
+                <w:rFonts w:ascii="Malgun Gothic" w:hAnsi="Malgun Gothic" w:eastAsia="Malgun Gothic" w:cs="Malgun Gothic"/>
+                <w:b w:val="0"/>
+                <w:i w:val="0"/>
+                <w:color w:val="000000"/>
+                <w:sz w:val="20"/>
+              </w:rPr>
+              <w:t>inside/outside hinge, normal-slope, front-aware sampling 적용</w:t>
+            </w:r>
+          </w:p>
+        </w:tc>
+      </w:tr>
+      <w:tr>
+        <w:tc>
+          <w:tcPr>
+            <w:tcW w:type="dxa" w:w="2088"/>
+            <w:vAlign w:val="center"/>
+          </w:tcPr>
+          <w:p>
+            <w:pPr>
+              <w:spacing w:before="0" w:after="0" w:line="240" w:lineRule="auto"/>
+              <w:jc w:val="left"/>
+            </w:pPr>
+            <w:r>
+              <w:rPr>
+                <w:rFonts w:ascii="Malgun Gothic" w:hAnsi="Malgun Gothic" w:eastAsia="Malgun Gothic" w:cs="Malgun Gothic"/>
+                <w:b w:val="0"/>
+                <w:i w:val="0"/>
+                <w:color w:val="000000"/>
+                <w:sz w:val="20"/>
+              </w:rPr>
+            </w:r>
+            <w:r>
+              <w:rPr>
+                <w:rFonts w:ascii="Malgun Gothic" w:hAnsi="Malgun Gothic" w:eastAsia="Malgun Gothic" w:cs="Malgun Gothic"/>
+                <w:b w:val="0"/>
+                <w:i w:val="0"/>
+                <w:color w:val="000000"/>
+                <w:sz w:val="20"/>
+              </w:rPr>
+              <w:t>D/r 식별성</w:t>
+            </w:r>
+          </w:p>
+        </w:tc>
+        <w:tc>
+          <w:tcPr>
+            <w:tcW w:type="dxa" w:w="3672"/>
+            <w:vAlign w:val="center"/>
+          </w:tcPr>
+          <w:p>
+            <w:pPr>
+              <w:spacing w:before="0" w:after="0" w:line="240" w:lineRule="auto"/>
+              <w:jc w:val="left"/>
+            </w:pPr>
+            <w:r>
+              <w:rPr>
+                <w:rFonts w:ascii="Malgun Gothic" w:hAnsi="Malgun Gothic" w:eastAsia="Malgun Gothic" w:cs="Malgun Gothic"/>
+                <w:b w:val="0"/>
+                <w:i w:val="0"/>
+                <w:color w:val="000000"/>
+                <w:sz w:val="20"/>
+              </w:rPr>
+            </w:r>
+            <w:r>
+              <w:rPr>
+                <w:rFonts w:ascii="Malgun Gothic" w:hAnsi="Malgun Gothic" w:eastAsia="Malgun Gothic" w:cs="Malgun Gothic"/>
+                <w:b w:val="0"/>
+                <w:i w:val="0"/>
+                <w:color w:val="000000"/>
+                <w:sz w:val="20"/>
+              </w:rPr>
+              <w:t>front speed는 D와 r의 곱에 민감하고 개별 계수는 약하게 식별됨</w:t>
+            </w:r>
+          </w:p>
+        </w:tc>
+        <w:tc>
+          <w:tcPr>
+            <w:tcW w:type="dxa" w:w="4680"/>
+            <w:vAlign w:val="center"/>
+          </w:tcPr>
+          <w:p>
+            <w:pPr>
+              <w:spacing w:before="0" w:after="0" w:line="240" w:lineRule="auto"/>
+              <w:jc w:val="left"/>
+            </w:pPr>
+            <w:r>
+              <w:rPr>
+                <w:rFonts w:ascii="Malgun Gothic" w:hAnsi="Malgun Gothic" w:eastAsia="Malgun Gothic" w:cs="Malgun Gothic"/>
+                <w:b w:val="0"/>
+                <w:i w:val="0"/>
+                <w:color w:val="000000"/>
+                <w:sz w:val="20"/>
+              </w:rPr>
+            </w:r>
+            <w:r>
+              <w:rPr>
+                <w:rFonts w:ascii="Malgun Gothic" w:hAnsi="Malgun Gothic" w:eastAsia="Malgun Gothic" w:cs="Malgun Gothic"/>
+                <w:b w:val="0"/>
+                <w:i w:val="0"/>
+                <w:color w:val="000000"/>
+                <w:sz w:val="20"/>
+              </w:rPr>
+              <w:t>physics anchor, coefficient regularization, learned physics reporting 적용</w:t>
+            </w:r>
+          </w:p>
+        </w:tc>
+      </w:tr>
+      <w:tr>
+        <w:tc>
+          <w:tcPr>
+            <w:tcW w:type="dxa" w:w="2088"/>
+            <w:vAlign w:val="center"/>
+          </w:tcPr>
+          <w:p>
+            <w:pPr>
+              <w:spacing w:before="0" w:after="0" w:line="240" w:lineRule="auto"/>
+              <w:jc w:val="left"/>
+            </w:pPr>
+            <w:r>
+              <w:rPr>
+                <w:rFonts w:ascii="Malgun Gothic" w:hAnsi="Malgun Gothic" w:eastAsia="Malgun Gothic" w:cs="Malgun Gothic"/>
+                <w:b w:val="0"/>
+                <w:i w:val="0"/>
+                <w:color w:val="000000"/>
+                <w:sz w:val="20"/>
+              </w:rPr>
+            </w:r>
+            <w:r>
+              <w:rPr>
+                <w:rFonts w:ascii="Malgun Gothic" w:hAnsi="Malgun Gothic" w:eastAsia="Malgun Gothic" w:cs="Malgun Gothic"/>
+                <w:b w:val="0"/>
+                <w:i w:val="0"/>
+                <w:color w:val="000000"/>
+                <w:sz w:val="20"/>
+              </w:rPr>
+              <w:t>RK4와 큰 정확도 차이</w:t>
+            </w:r>
+          </w:p>
+        </w:tc>
+        <w:tc>
+          <w:tcPr>
+            <w:tcW w:type="dxa" w:w="3672"/>
+            <w:vAlign w:val="center"/>
+          </w:tcPr>
+          <w:p>
+            <w:pPr>
+              <w:spacing w:before="0" w:after="0" w:line="240" w:lineRule="auto"/>
+              <w:jc w:val="left"/>
+            </w:pPr>
+            <w:r>
+              <w:rPr>
+                <w:rFonts w:ascii="Malgun Gothic" w:hAnsi="Malgun Gothic" w:eastAsia="Malgun Gothic" w:cs="Malgun Gothic"/>
+                <w:b w:val="0"/>
+                <w:i w:val="0"/>
+                <w:color w:val="000000"/>
+                <w:sz w:val="20"/>
+              </w:rPr>
+            </w:r>
+            <w:r>
+              <w:rPr>
+                <w:rFonts w:ascii="Malgun Gothic" w:hAnsi="Malgun Gothic" w:eastAsia="Malgun Gothic" w:cs="Malgun Gothic"/>
+                <w:b w:val="0"/>
+                <w:i w:val="0"/>
+                <w:color w:val="000000"/>
+                <w:sz w:val="20"/>
+              </w:rPr>
+              <w:t>PINN은 연속 surrogate 최적화이고 RK4는 고정 격자 forward 적분</w:t>
+            </w:r>
+          </w:p>
+        </w:tc>
+        <w:tc>
+          <w:tcPr>
+            <w:tcW w:type="dxa" w:w="4680"/>
+            <w:vAlign w:val="center"/>
+          </w:tcPr>
+          <w:p>
+            <w:pPr>
+              <w:spacing w:before="0" w:after="0" w:line="240" w:lineRule="auto"/>
+              <w:jc w:val="left"/>
+            </w:pPr>
+            <w:r>
+              <w:rPr>
+                <w:rFonts w:ascii="Malgun Gothic" w:hAnsi="Malgun Gothic" w:eastAsia="Malgun Gothic" w:cs="Malgun Gothic"/>
+                <w:b w:val="0"/>
+                <w:i w:val="0"/>
+                <w:color w:val="000000"/>
+                <w:sz w:val="20"/>
+              </w:rPr>
+            </w:r>
+            <w:r>
+              <w:rPr>
+                <w:rFonts w:ascii="Malgun Gothic" w:hAnsi="Malgun Gothic" w:eastAsia="Malgun Gothic" w:cs="Malgun Gothic"/>
+                <w:b w:val="0"/>
+                <w:i w:val="0"/>
+                <w:color w:val="000000"/>
+                <w:sz w:val="20"/>
+              </w:rPr>
+              <w:t>RK4 reference, weak teacher, final-field/front/mass 공동 검증 적용</w:t>
             </w:r>
           </w:p>
         </w:tc>
@@ -1827,7 +2332,1759 @@
           <w:color w:val="000000"/>
           <w:sz w:val="20"/>
         </w:rPr>
-        <w:t>6. 한국 산림청 데이터와 문제 구성</w:t>
+        <w:t>6. 실패 모드별 진단 근거</w:t>
+      </w:r>
+    </w:p>
+    <w:p>
+      <w:pPr>
+        <w:spacing w:before="0" w:after="80" w:line="252" w:lineRule="auto"/>
+      </w:pPr>
+      <w:r>
+        <w:rPr>
+          <w:rFonts w:ascii="Malgun Gothic" w:hAnsi="Malgun Gothic" w:eastAsia="Malgun Gothic" w:cs="Malgun Gothic"/>
+          <w:b w:val="0"/>
+          <w:i w:val="0"/>
+          <w:color w:val="000000"/>
+          <w:sz w:val="20"/>
+        </w:rPr>
+        <w:t>기본 PINN에서 발생한 문제는 단일 loss 값만으로 판단하지 않는다. 관측점 MSE, PDE residual, final-time field error, front-area metric, active-front band, mass trajectory, learned D/r, error map, GIF를 함께 보고 어느 실패 모드가 우세한지 분류한다. 이 방식은 PINN이 관측점에서는 좋아 보이지만 전체장에서는 틀리는 상황을 분리하기 위한 절차다.</w:t>
+      </w:r>
+    </w:p>
+    <w:p>
+      <w:pPr>
+        <w:spacing w:before="0" w:after="80" w:line="252" w:lineRule="auto"/>
+      </w:pPr>
+      <w:r>
+        <w:rPr>
+          <w:rFonts w:ascii="Malgun Gothic" w:hAnsi="Malgun Gothic" w:eastAsia="Malgun Gothic" w:cs="Malgun Gothic"/>
+          <w:b w:val="0"/>
+          <w:i w:val="0"/>
+          <w:color w:val="000000"/>
+          <w:sz w:val="20"/>
+        </w:rPr>
+        <w:t>초기 checkpoint 복원 문제는 validation observation MSE가 가장 낮은 시점과 실제 final-field 성능이 일치하지 않는 데서 드러났다. 1200 epochs를 실행했는데도 epoch 1이 복원된 것은 최적화가 실패했다는 뜻이 아니라, 모델 선택 기준이 학습 목적과 어긋났다는 의미다. 따라서 현재 보고 기준은 checkpoint epoch, checkpoint score, validation MSE, PDE residual, teacher proxy를 함께 기록한다.</w:t>
+      </w:r>
+    </w:p>
+    <w:p>
+      <w:pPr>
+        <w:spacing w:before="0" w:after="80" w:line="252" w:lineRule="auto"/>
+      </w:pPr>
+      <w:r>
+        <w:rPr>
+          <w:rFonts w:ascii="Malgun Gothic" w:hAnsi="Malgun Gothic" w:eastAsia="Malgun Gothic" w:cs="Malgun Gothic"/>
+          <w:b w:val="0"/>
+          <w:i w:val="0"/>
+          <w:color w:val="000000"/>
+          <w:sz w:val="20"/>
+        </w:rPr>
+        <w:t>front phase error와 twin-trap error band는 absolute-error map에서 active front 주변에 쌍봉형 또는 고리형 오차가 생기는 형태로 나타난다. 이 현상은 front의 면적만 맞추고 안쪽-바깥쪽 순서, level value, normal slope를 동시에 맞추지 못할 때 발생한다. field L2가 커지는 주된 원인이므로 front contour, active-front area, low-level support recall을 별도로 확인한다.</w:t>
+      </w:r>
+    </w:p>
+    <w:p>
+      <w:pPr>
+        <w:spacing w:before="0" w:after="80" w:line="252" w:lineRule="auto"/>
+      </w:pPr>
+      <w:r>
+        <w:rPr>
+          <w:rFonts w:ascii="Malgun Gothic" w:hAnsi="Malgun Gothic" w:eastAsia="Malgun Gothic" w:cs="Malgun Gothic"/>
+          <w:b w:val="0"/>
+          <w:i w:val="0"/>
+          <w:color w:val="000000"/>
+          <w:sz w:val="20"/>
+        </w:rPr>
+        <w:t>산림청 PINN에서는 mean relative L2와 mass error만으로 충분하지 않다. 최근 full run에서 PINN은 mass error를 줄였지만 support false-negative가 남아 실제 감염 support를 보수적으로 놓칠 수 있었다. 따라서 산림청 결과는 relative L2, correlation, mass error, support FNR/FPR, Dice/Tversky, sea leakage 여부를 함께 제시한다.</w:t>
+      </w:r>
+    </w:p>
+    <w:tbl>
+      <w:tblGrid>
+        <w:gridCol w:w="2376"/>
+        <w:gridCol w:w="4536"/>
+        <w:gridCol w:w="3528"/>
+      </w:tblGrid>
+      <w:tblPr>
+        <w:tblStyle w:val="TableGrid"/>
+        <w:tblW w:type="dxa" w:w="10440"/>
+        <w:jc w:val="center"/>
+        <w:tblLayout w:type="fixed"/>
+        <w:tblLook w:firstColumn="1" w:firstRow="1" w:lastColumn="0" w:lastRow="0" w:noHBand="0" w:noVBand="1" w:val="04A0"/>
+        <w:tblCellMar>
+          <w:top w:w="90" w:type="dxa"/>
+          <w:bottom w:w="90" w:type="dxa"/>
+          <w:left w:w="140" w:type="dxa"/>
+          <w:right w:w="140" w:type="dxa"/>
+          <w:start w:w="140" w:type="dxa"/>
+          <w:end w:w="140" w:type="dxa"/>
+        </w:tblCellMar>
+        <w:tblInd w:type="dxa" w:w="0"/>
+      </w:tblPr>
+      <w:tr>
+        <w:tc>
+          <w:tcPr>
+            <w:tcW w:type="dxa" w:w="2376"/>
+            <w:vAlign w:val="center"/>
+          </w:tcPr>
+          <w:p>
+            <w:pPr>
+              <w:spacing w:before="0" w:after="0" w:line="240" w:lineRule="auto"/>
+              <w:jc w:val="center"/>
+            </w:pPr>
+            <w:r>
+              <w:rPr>
+                <w:rFonts w:ascii="Malgun Gothic" w:hAnsi="Malgun Gothic" w:eastAsia="Malgun Gothic" w:cs="Malgun Gothic"/>
+                <w:b w:val="0"/>
+                <w:i w:val="0"/>
+                <w:color w:val="000000"/>
+                <w:sz w:val="20"/>
+              </w:rPr>
+            </w:r>
+            <w:r>
+              <w:rPr>
+                <w:rFonts w:ascii="Malgun Gothic" w:hAnsi="Malgun Gothic" w:eastAsia="Malgun Gothic" w:cs="Malgun Gothic"/>
+                <w:b/>
+                <w:i w:val="0"/>
+                <w:color w:val="000000"/>
+                <w:sz w:val="20"/>
+              </w:rPr>
+              <w:t>진단 항목</w:t>
+            </w:r>
+          </w:p>
+        </w:tc>
+        <w:tc>
+          <w:tcPr>
+            <w:tcW w:type="dxa" w:w="4536"/>
+            <w:vAlign w:val="center"/>
+          </w:tcPr>
+          <w:p>
+            <w:pPr>
+              <w:spacing w:before="0" w:after="0" w:line="240" w:lineRule="auto"/>
+              <w:jc w:val="center"/>
+            </w:pPr>
+            <w:r>
+              <w:rPr>
+                <w:rFonts w:ascii="Malgun Gothic" w:hAnsi="Malgun Gothic" w:eastAsia="Malgun Gothic" w:cs="Malgun Gothic"/>
+                <w:b w:val="0"/>
+                <w:i w:val="0"/>
+                <w:color w:val="000000"/>
+                <w:sz w:val="20"/>
+              </w:rPr>
+            </w:r>
+            <w:r>
+              <w:rPr>
+                <w:rFonts w:ascii="Malgun Gothic" w:hAnsi="Malgun Gothic" w:eastAsia="Malgun Gothic" w:cs="Malgun Gothic"/>
+                <w:b/>
+                <w:i w:val="0"/>
+                <w:color w:val="000000"/>
+                <w:sz w:val="20"/>
+              </w:rPr>
+              <w:t>문제가 드러나는 신호</w:t>
+            </w:r>
+          </w:p>
+        </w:tc>
+        <w:tc>
+          <w:tcPr>
+            <w:tcW w:type="dxa" w:w="3528"/>
+            <w:vAlign w:val="center"/>
+          </w:tcPr>
+          <w:p>
+            <w:pPr>
+              <w:spacing w:before="0" w:after="0" w:line="240" w:lineRule="auto"/>
+              <w:jc w:val="center"/>
+            </w:pPr>
+            <w:r>
+              <w:rPr>
+                <w:rFonts w:ascii="Malgun Gothic" w:hAnsi="Malgun Gothic" w:eastAsia="Malgun Gothic" w:cs="Malgun Gothic"/>
+                <w:b w:val="0"/>
+                <w:i w:val="0"/>
+                <w:color w:val="000000"/>
+                <w:sz w:val="20"/>
+              </w:rPr>
+            </w:r>
+            <w:r>
+              <w:rPr>
+                <w:rFonts w:ascii="Malgun Gothic" w:hAnsi="Malgun Gothic" w:eastAsia="Malgun Gothic" w:cs="Malgun Gothic"/>
+                <w:b/>
+                <w:i w:val="0"/>
+                <w:color w:val="000000"/>
+                <w:sz w:val="20"/>
+              </w:rPr>
+              <w:t>확인 산출물</w:t>
+            </w:r>
+          </w:p>
+        </w:tc>
+      </w:tr>
+      <w:tr>
+        <w:tc>
+          <w:tcPr>
+            <w:tcW w:type="dxa" w:w="2376"/>
+            <w:vAlign w:val="center"/>
+          </w:tcPr>
+          <w:p>
+            <w:pPr>
+              <w:spacing w:before="0" w:after="0" w:line="240" w:lineRule="auto"/>
+              <w:jc w:val="left"/>
+            </w:pPr>
+            <w:r>
+              <w:rPr>
+                <w:rFonts w:ascii="Malgun Gothic" w:hAnsi="Malgun Gothic" w:eastAsia="Malgun Gothic" w:cs="Malgun Gothic"/>
+                <w:b w:val="0"/>
+                <w:i w:val="0"/>
+                <w:color w:val="000000"/>
+                <w:sz w:val="20"/>
+              </w:rPr>
+            </w:r>
+            <w:r>
+              <w:rPr>
+                <w:rFonts w:ascii="Malgun Gothic" w:hAnsi="Malgun Gothic" w:eastAsia="Malgun Gothic" w:cs="Malgun Gothic"/>
+                <w:b w:val="0"/>
+                <w:i w:val="0"/>
+                <w:color w:val="000000"/>
+                <w:sz w:val="20"/>
+              </w:rPr>
+              <w:t>checkpoint mismatch</w:t>
+            </w:r>
+          </w:p>
+        </w:tc>
+        <w:tc>
+          <w:tcPr>
+            <w:tcW w:type="dxa" w:w="4536"/>
+            <w:vAlign w:val="center"/>
+          </w:tcPr>
+          <w:p>
+            <w:pPr>
+              <w:spacing w:before="0" w:after="0" w:line="240" w:lineRule="auto"/>
+              <w:jc w:val="left"/>
+            </w:pPr>
+            <w:r>
+              <w:rPr>
+                <w:rFonts w:ascii="Malgun Gothic" w:hAnsi="Malgun Gothic" w:eastAsia="Malgun Gothic" w:cs="Malgun Gothic"/>
+                <w:b w:val="0"/>
+                <w:i w:val="0"/>
+                <w:color w:val="000000"/>
+                <w:sz w:val="20"/>
+              </w:rPr>
+            </w:r>
+            <w:r>
+              <w:rPr>
+                <w:rFonts w:ascii="Malgun Gothic" w:hAnsi="Malgun Gothic" w:eastAsia="Malgun Gothic" w:cs="Malgun Gothic"/>
+                <w:b w:val="0"/>
+                <w:i w:val="0"/>
+                <w:color w:val="000000"/>
+                <w:sz w:val="20"/>
+              </w:rPr>
+              <w:t>best epoch가 지나치게 이르고 final field가 좋지 않음</w:t>
+            </w:r>
+          </w:p>
+        </w:tc>
+        <w:tc>
+          <w:tcPr>
+            <w:tcW w:type="dxa" w:w="3528"/>
+            <w:vAlign w:val="center"/>
+          </w:tcPr>
+          <w:p>
+            <w:pPr>
+              <w:spacing w:before="0" w:after="0" w:line="240" w:lineRule="auto"/>
+              <w:jc w:val="left"/>
+            </w:pPr>
+            <w:r>
+              <w:rPr>
+                <w:rFonts w:ascii="Malgun Gothic" w:hAnsi="Malgun Gothic" w:eastAsia="Malgun Gothic" w:cs="Malgun Gothic"/>
+                <w:b w:val="0"/>
+                <w:i w:val="0"/>
+                <w:color w:val="000000"/>
+                <w:sz w:val="20"/>
+              </w:rPr>
+            </w:r>
+            <w:r>
+              <w:rPr>
+                <w:rFonts w:ascii="Malgun Gothic" w:hAnsi="Malgun Gothic" w:eastAsia="Malgun Gothic" w:cs="Malgun Gothic"/>
+                <w:b w:val="0"/>
+                <w:i w:val="0"/>
+                <w:color w:val="000000"/>
+                <w:sz w:val="20"/>
+              </w:rPr>
+              <w:t>metrics.json, training_diagnostics.png</w:t>
+            </w:r>
+          </w:p>
+        </w:tc>
+      </w:tr>
+      <w:tr>
+        <w:tc>
+          <w:tcPr>
+            <w:tcW w:type="dxa" w:w="2376"/>
+            <w:vAlign w:val="center"/>
+          </w:tcPr>
+          <w:p>
+            <w:pPr>
+              <w:spacing w:before="0" w:after="0" w:line="240" w:lineRule="auto"/>
+              <w:jc w:val="left"/>
+            </w:pPr>
+            <w:r>
+              <w:rPr>
+                <w:rFonts w:ascii="Malgun Gothic" w:hAnsi="Malgun Gothic" w:eastAsia="Malgun Gothic" w:cs="Malgun Gothic"/>
+                <w:b w:val="0"/>
+                <w:i w:val="0"/>
+                <w:color w:val="000000"/>
+                <w:sz w:val="20"/>
+              </w:rPr>
+            </w:r>
+            <w:r>
+              <w:rPr>
+                <w:rFonts w:ascii="Malgun Gothic" w:hAnsi="Malgun Gothic" w:eastAsia="Malgun Gothic" w:cs="Malgun Gothic"/>
+                <w:b w:val="0"/>
+                <w:i w:val="0"/>
+                <w:color w:val="000000"/>
+                <w:sz w:val="20"/>
+              </w:rPr>
+              <w:t>diffuse haze</w:t>
+            </w:r>
+          </w:p>
+        </w:tc>
+        <w:tc>
+          <w:tcPr>
+            <w:tcW w:type="dxa" w:w="4536"/>
+            <w:vAlign w:val="center"/>
+          </w:tcPr>
+          <w:p>
+            <w:pPr>
+              <w:spacing w:before="0" w:after="0" w:line="240" w:lineRule="auto"/>
+              <w:jc w:val="left"/>
+            </w:pPr>
+            <w:r>
+              <w:rPr>
+                <w:rFonts w:ascii="Malgun Gothic" w:hAnsi="Malgun Gothic" w:eastAsia="Malgun Gothic" w:cs="Malgun Gothic"/>
+                <w:b w:val="0"/>
+                <w:i w:val="0"/>
+                <w:color w:val="000000"/>
+                <w:sz w:val="20"/>
+              </w:rPr>
+            </w:r>
+            <w:r>
+              <w:rPr>
+                <w:rFonts w:ascii="Malgun Gothic" w:hAnsi="Malgun Gothic" w:eastAsia="Malgun Gothic" w:cs="Malgun Gothic"/>
+                <w:b w:val="0"/>
+                <w:i w:val="0"/>
+                <w:color w:val="000000"/>
+                <w:sz w:val="20"/>
+              </w:rPr>
+              <w:t>넓은 저농도 영역이 생기며 front contour가 흐려짐</w:t>
+            </w:r>
+          </w:p>
+        </w:tc>
+        <w:tc>
+          <w:tcPr>
+            <w:tcW w:type="dxa" w:w="3528"/>
+            <w:vAlign w:val="center"/>
+          </w:tcPr>
+          <w:p>
+            <w:pPr>
+              <w:spacing w:before="0" w:after="0" w:line="240" w:lineRule="auto"/>
+              <w:jc w:val="left"/>
+            </w:pPr>
+            <w:r>
+              <w:rPr>
+                <w:rFonts w:ascii="Malgun Gothic" w:hAnsi="Malgun Gothic" w:eastAsia="Malgun Gothic" w:cs="Malgun Gothic"/>
+                <w:b w:val="0"/>
+                <w:i w:val="0"/>
+                <w:color w:val="000000"/>
+                <w:sz w:val="20"/>
+              </w:rPr>
+            </w:r>
+            <w:r>
+              <w:rPr>
+                <w:rFonts w:ascii="Malgun Gothic" w:hAnsi="Malgun Gothic" w:eastAsia="Malgun Gothic" w:cs="Malgun Gothic"/>
+                <w:b w:val="0"/>
+                <w:i w:val="0"/>
+                <w:color w:val="000000"/>
+                <w:sz w:val="20"/>
+              </w:rPr>
+              <w:t>reconstruction.png, spacetime_error.png</w:t>
+            </w:r>
+          </w:p>
+        </w:tc>
+      </w:tr>
+      <w:tr>
+        <w:tc>
+          <w:tcPr>
+            <w:tcW w:type="dxa" w:w="2376"/>
+            <w:vAlign w:val="center"/>
+          </w:tcPr>
+          <w:p>
+            <w:pPr>
+              <w:spacing w:before="0" w:after="0" w:line="240" w:lineRule="auto"/>
+              <w:jc w:val="left"/>
+            </w:pPr>
+            <w:r>
+              <w:rPr>
+                <w:rFonts w:ascii="Malgun Gothic" w:hAnsi="Malgun Gothic" w:eastAsia="Malgun Gothic" w:cs="Malgun Gothic"/>
+                <w:b w:val="0"/>
+                <w:i w:val="0"/>
+                <w:color w:val="000000"/>
+                <w:sz w:val="20"/>
+              </w:rPr>
+            </w:r>
+            <w:r>
+              <w:rPr>
+                <w:rFonts w:ascii="Malgun Gothic" w:hAnsi="Malgun Gothic" w:eastAsia="Malgun Gothic" w:cs="Malgun Gothic"/>
+                <w:b w:val="0"/>
+                <w:i w:val="0"/>
+                <w:color w:val="000000"/>
+                <w:sz w:val="20"/>
+              </w:rPr>
+              <w:t>all-zero collapse</w:t>
+            </w:r>
+          </w:p>
+        </w:tc>
+        <w:tc>
+          <w:tcPr>
+            <w:tcW w:type="dxa" w:w="4536"/>
+            <w:vAlign w:val="center"/>
+          </w:tcPr>
+          <w:p>
+            <w:pPr>
+              <w:spacing w:before="0" w:after="0" w:line="240" w:lineRule="auto"/>
+              <w:jc w:val="left"/>
+            </w:pPr>
+            <w:r>
+              <w:rPr>
+                <w:rFonts w:ascii="Malgun Gothic" w:hAnsi="Malgun Gothic" w:eastAsia="Malgun Gothic" w:cs="Malgun Gothic"/>
+                <w:b w:val="0"/>
+                <w:i w:val="0"/>
+                <w:color w:val="000000"/>
+                <w:sz w:val="20"/>
+              </w:rPr>
+            </w:r>
+            <w:r>
+              <w:rPr>
+                <w:rFonts w:ascii="Malgun Gothic" w:hAnsi="Malgun Gothic" w:eastAsia="Malgun Gothic" w:cs="Malgun Gothic"/>
+                <w:b w:val="0"/>
+                <w:i w:val="0"/>
+                <w:color w:val="000000"/>
+                <w:sz w:val="20"/>
+              </w:rPr>
+              <w:t>관측 MSE는 작지만 mass와 support가 급감</w:t>
+            </w:r>
+          </w:p>
+        </w:tc>
+        <w:tc>
+          <w:tcPr>
+            <w:tcW w:type="dxa" w:w="3528"/>
+            <w:vAlign w:val="center"/>
+          </w:tcPr>
+          <w:p>
+            <w:pPr>
+              <w:spacing w:before="0" w:after="0" w:line="240" w:lineRule="auto"/>
+              <w:jc w:val="left"/>
+            </w:pPr>
+            <w:r>
+              <w:rPr>
+                <w:rFonts w:ascii="Malgun Gothic" w:hAnsi="Malgun Gothic" w:eastAsia="Malgun Gothic" w:cs="Malgun Gothic"/>
+                <w:b w:val="0"/>
+                <w:i w:val="0"/>
+                <w:color w:val="000000"/>
+                <w:sz w:val="20"/>
+              </w:rPr>
+            </w:r>
+            <w:r>
+              <w:rPr>
+                <w:rFonts w:ascii="Malgun Gothic" w:hAnsi="Malgun Gothic" w:eastAsia="Malgun Gothic" w:cs="Malgun Gothic"/>
+                <w:b w:val="0"/>
+                <w:i w:val="0"/>
+                <w:color w:val="000000"/>
+                <w:sz w:val="20"/>
+              </w:rPr>
+              <w:t>mass trajectory, support metric</w:t>
+            </w:r>
+          </w:p>
+        </w:tc>
+      </w:tr>
+      <w:tr>
+        <w:tc>
+          <w:tcPr>
+            <w:tcW w:type="dxa" w:w="2376"/>
+            <w:vAlign w:val="center"/>
+          </w:tcPr>
+          <w:p>
+            <w:pPr>
+              <w:spacing w:before="0" w:after="0" w:line="240" w:lineRule="auto"/>
+              <w:jc w:val="left"/>
+            </w:pPr>
+            <w:r>
+              <w:rPr>
+                <w:rFonts w:ascii="Malgun Gothic" w:hAnsi="Malgun Gothic" w:eastAsia="Malgun Gothic" w:cs="Malgun Gothic"/>
+                <w:b w:val="0"/>
+                <w:i w:val="0"/>
+                <w:color w:val="000000"/>
+                <w:sz w:val="20"/>
+              </w:rPr>
+            </w:r>
+            <w:r>
+              <w:rPr>
+                <w:rFonts w:ascii="Malgun Gothic" w:hAnsi="Malgun Gothic" w:eastAsia="Malgun Gothic" w:cs="Malgun Gothic"/>
+                <w:b w:val="0"/>
+                <w:i w:val="0"/>
+                <w:color w:val="000000"/>
+                <w:sz w:val="20"/>
+              </w:rPr>
+              <w:t>front phase error</w:t>
+            </w:r>
+          </w:p>
+        </w:tc>
+        <w:tc>
+          <w:tcPr>
+            <w:tcW w:type="dxa" w:w="4536"/>
+            <w:vAlign w:val="center"/>
+          </w:tcPr>
+          <w:p>
+            <w:pPr>
+              <w:spacing w:before="0" w:after="0" w:line="240" w:lineRule="auto"/>
+              <w:jc w:val="left"/>
+            </w:pPr>
+            <w:r>
+              <w:rPr>
+                <w:rFonts w:ascii="Malgun Gothic" w:hAnsi="Malgun Gothic" w:eastAsia="Malgun Gothic" w:cs="Malgun Gothic"/>
+                <w:b w:val="0"/>
+                <w:i w:val="0"/>
+                <w:color w:val="000000"/>
+                <w:sz w:val="20"/>
+              </w:rPr>
+            </w:r>
+            <w:r>
+              <w:rPr>
+                <w:rFonts w:ascii="Malgun Gothic" w:hAnsi="Malgun Gothic" w:eastAsia="Malgun Gothic" w:cs="Malgun Gothic"/>
+                <w:b w:val="0"/>
+                <w:i w:val="0"/>
+                <w:color w:val="000000"/>
+                <w:sz w:val="20"/>
+              </w:rPr>
+              <w:t>front 앞뒤로 큰 absolute-error band가 형성</w:t>
+            </w:r>
+          </w:p>
+        </w:tc>
+        <w:tc>
+          <w:tcPr>
+            <w:tcW w:type="dxa" w:w="3528"/>
+            <w:vAlign w:val="center"/>
+          </w:tcPr>
+          <w:p>
+            <w:pPr>
+              <w:spacing w:before="0" w:after="0" w:line="240" w:lineRule="auto"/>
+              <w:jc w:val="left"/>
+            </w:pPr>
+            <w:r>
+              <w:rPr>
+                <w:rFonts w:ascii="Malgun Gothic" w:hAnsi="Malgun Gothic" w:eastAsia="Malgun Gothic" w:cs="Malgun Gothic"/>
+                <w:b w:val="0"/>
+                <w:i w:val="0"/>
+                <w:color w:val="000000"/>
+                <w:sz w:val="20"/>
+              </w:rPr>
+            </w:r>
+            <w:r>
+              <w:rPr>
+                <w:rFonts w:ascii="Malgun Gothic" w:hAnsi="Malgun Gothic" w:eastAsia="Malgun Gothic" w:cs="Malgun Gothic"/>
+                <w:b w:val="0"/>
+                <w:i w:val="0"/>
+                <w:color w:val="000000"/>
+                <w:sz w:val="20"/>
+              </w:rPr>
+              <w:t>pinn_vs_rk4_comparison.png</w:t>
+            </w:r>
+          </w:p>
+        </w:tc>
+      </w:tr>
+      <w:tr>
+        <w:tc>
+          <w:tcPr>
+            <w:tcW w:type="dxa" w:w="2376"/>
+            <w:vAlign w:val="center"/>
+          </w:tcPr>
+          <w:p>
+            <w:pPr>
+              <w:spacing w:before="0" w:after="0" w:line="240" w:lineRule="auto"/>
+              <w:jc w:val="left"/>
+            </w:pPr>
+            <w:r>
+              <w:rPr>
+                <w:rFonts w:ascii="Malgun Gothic" w:hAnsi="Malgun Gothic" w:eastAsia="Malgun Gothic" w:cs="Malgun Gothic"/>
+                <w:b w:val="0"/>
+                <w:i w:val="0"/>
+                <w:color w:val="000000"/>
+                <w:sz w:val="20"/>
+              </w:rPr>
+            </w:r>
+            <w:r>
+              <w:rPr>
+                <w:rFonts w:ascii="Malgun Gothic" w:hAnsi="Malgun Gothic" w:eastAsia="Malgun Gothic" w:cs="Malgun Gothic"/>
+                <w:b w:val="0"/>
+                <w:i w:val="0"/>
+                <w:color w:val="000000"/>
+                <w:sz w:val="20"/>
+              </w:rPr>
+              <w:t>twin-trap band</w:t>
+            </w:r>
+          </w:p>
+        </w:tc>
+        <w:tc>
+          <w:tcPr>
+            <w:tcW w:type="dxa" w:w="4536"/>
+            <w:vAlign w:val="center"/>
+          </w:tcPr>
+          <w:p>
+            <w:pPr>
+              <w:spacing w:before="0" w:after="0" w:line="240" w:lineRule="auto"/>
+              <w:jc w:val="left"/>
+            </w:pPr>
+            <w:r>
+              <w:rPr>
+                <w:rFonts w:ascii="Malgun Gothic" w:hAnsi="Malgun Gothic" w:eastAsia="Malgun Gothic" w:cs="Malgun Gothic"/>
+                <w:b w:val="0"/>
+                <w:i w:val="0"/>
+                <w:color w:val="000000"/>
+                <w:sz w:val="20"/>
+              </w:rPr>
+            </w:r>
+            <w:r>
+              <w:rPr>
+                <w:rFonts w:ascii="Malgun Gothic" w:hAnsi="Malgun Gothic" w:eastAsia="Malgun Gothic" w:cs="Malgun Gothic"/>
+                <w:b w:val="0"/>
+                <w:i w:val="0"/>
+                <w:color w:val="000000"/>
+                <w:sz w:val="20"/>
+              </w:rPr>
+              <w:t>front 양쪽에 대칭적 고리형 error가 남음</w:t>
+            </w:r>
+          </w:p>
+        </w:tc>
+        <w:tc>
+          <w:tcPr>
+            <w:tcW w:type="dxa" w:w="3528"/>
+            <w:vAlign w:val="center"/>
+          </w:tcPr>
+          <w:p>
+            <w:pPr>
+              <w:spacing w:before="0" w:after="0" w:line="240" w:lineRule="auto"/>
+              <w:jc w:val="left"/>
+            </w:pPr>
+            <w:r>
+              <w:rPr>
+                <w:rFonts w:ascii="Malgun Gothic" w:hAnsi="Malgun Gothic" w:eastAsia="Malgun Gothic" w:cs="Malgun Gothic"/>
+                <w:b w:val="0"/>
+                <w:i w:val="0"/>
+                <w:color w:val="000000"/>
+                <w:sz w:val="20"/>
+              </w:rPr>
+            </w:r>
+            <w:r>
+              <w:rPr>
+                <w:rFonts w:ascii="Malgun Gothic" w:hAnsi="Malgun Gothic" w:eastAsia="Malgun Gothic" w:cs="Malgun Gothic"/>
+                <w:b w:val="0"/>
+                <w:i w:val="0"/>
+                <w:color w:val="000000"/>
+                <w:sz w:val="20"/>
+              </w:rPr>
+              <w:t>residual_front_diagnostics.png</w:t>
+            </w:r>
+          </w:p>
+        </w:tc>
+      </w:tr>
+      <w:tr>
+        <w:tc>
+          <w:tcPr>
+            <w:tcW w:type="dxa" w:w="2376"/>
+            <w:vAlign w:val="center"/>
+          </w:tcPr>
+          <w:p>
+            <w:pPr>
+              <w:spacing w:before="0" w:after="0" w:line="240" w:lineRule="auto"/>
+              <w:jc w:val="left"/>
+            </w:pPr>
+            <w:r>
+              <w:rPr>
+                <w:rFonts w:ascii="Malgun Gothic" w:hAnsi="Malgun Gothic" w:eastAsia="Malgun Gothic" w:cs="Malgun Gothic"/>
+                <w:b w:val="0"/>
+                <w:i w:val="0"/>
+                <w:color w:val="000000"/>
+                <w:sz w:val="20"/>
+              </w:rPr>
+            </w:r>
+            <w:r>
+              <w:rPr>
+                <w:rFonts w:ascii="Malgun Gothic" w:hAnsi="Malgun Gothic" w:eastAsia="Malgun Gothic" w:cs="Malgun Gothic"/>
+                <w:b w:val="0"/>
+                <w:i w:val="0"/>
+                <w:color w:val="000000"/>
+                <w:sz w:val="20"/>
+              </w:rPr>
+              <w:t>D/r ambiguity</w:t>
+            </w:r>
+          </w:p>
+        </w:tc>
+        <w:tc>
+          <w:tcPr>
+            <w:tcW w:type="dxa" w:w="4536"/>
+            <w:vAlign w:val="center"/>
+          </w:tcPr>
+          <w:p>
+            <w:pPr>
+              <w:spacing w:before="0" w:after="0" w:line="240" w:lineRule="auto"/>
+              <w:jc w:val="left"/>
+            </w:pPr>
+            <w:r>
+              <w:rPr>
+                <w:rFonts w:ascii="Malgun Gothic" w:hAnsi="Malgun Gothic" w:eastAsia="Malgun Gothic" w:cs="Malgun Gothic"/>
+                <w:b w:val="0"/>
+                <w:i w:val="0"/>
+                <w:color w:val="000000"/>
+                <w:sz w:val="20"/>
+              </w:rPr>
+            </w:r>
+            <w:r>
+              <w:rPr>
+                <w:rFonts w:ascii="Malgun Gothic" w:hAnsi="Malgun Gothic" w:eastAsia="Malgun Gothic" w:cs="Malgun Gothic"/>
+                <w:b w:val="0"/>
+                <w:i w:val="0"/>
+                <w:color w:val="000000"/>
+                <w:sz w:val="20"/>
+              </w:rPr>
+              <w:t>front speed는 맞지만 D와 r의 개별값이 흔들림</w:t>
+            </w:r>
+          </w:p>
+        </w:tc>
+        <w:tc>
+          <w:tcPr>
+            <w:tcW w:type="dxa" w:w="3528"/>
+            <w:vAlign w:val="center"/>
+          </w:tcPr>
+          <w:p>
+            <w:pPr>
+              <w:spacing w:before="0" w:after="0" w:line="240" w:lineRule="auto"/>
+              <w:jc w:val="left"/>
+            </w:pPr>
+            <w:r>
+              <w:rPr>
+                <w:rFonts w:ascii="Malgun Gothic" w:hAnsi="Malgun Gothic" w:eastAsia="Malgun Gothic" w:cs="Malgun Gothic"/>
+                <w:b w:val="0"/>
+                <w:i w:val="0"/>
+                <w:color w:val="000000"/>
+                <w:sz w:val="20"/>
+              </w:rPr>
+            </w:r>
+            <w:r>
+              <w:rPr>
+                <w:rFonts w:ascii="Malgun Gothic" w:hAnsi="Malgun Gothic" w:eastAsia="Malgun Gothic" w:cs="Malgun Gothic"/>
+                <w:b w:val="0"/>
+                <w:i w:val="0"/>
+                <w:color w:val="000000"/>
+                <w:sz w:val="20"/>
+              </w:rPr>
+              <w:t>learned physics, coefficient stats</w:t>
+            </w:r>
+          </w:p>
+        </w:tc>
+      </w:tr>
+      <w:tr>
+        <w:tc>
+          <w:tcPr>
+            <w:tcW w:type="dxa" w:w="2376"/>
+            <w:vAlign w:val="center"/>
+          </w:tcPr>
+          <w:p>
+            <w:pPr>
+              <w:spacing w:before="0" w:after="0" w:line="240" w:lineRule="auto"/>
+              <w:jc w:val="left"/>
+            </w:pPr>
+            <w:r>
+              <w:rPr>
+                <w:rFonts w:ascii="Malgun Gothic" w:hAnsi="Malgun Gothic" w:eastAsia="Malgun Gothic" w:cs="Malgun Gothic"/>
+                <w:b w:val="0"/>
+                <w:i w:val="0"/>
+                <w:color w:val="000000"/>
+                <w:sz w:val="20"/>
+              </w:rPr>
+            </w:r>
+            <w:r>
+              <w:rPr>
+                <w:rFonts w:ascii="Malgun Gothic" w:hAnsi="Malgun Gothic" w:eastAsia="Malgun Gothic" w:cs="Malgun Gothic"/>
+                <w:b w:val="0"/>
+                <w:i w:val="0"/>
+                <w:color w:val="000000"/>
+                <w:sz w:val="20"/>
+              </w:rPr>
+              <w:t>Korea support miss</w:t>
+            </w:r>
+          </w:p>
+        </w:tc>
+        <w:tc>
+          <w:tcPr>
+            <w:tcW w:type="dxa" w:w="4536"/>
+            <w:vAlign w:val="center"/>
+          </w:tcPr>
+          <w:p>
+            <w:pPr>
+              <w:spacing w:before="0" w:after="0" w:line="240" w:lineRule="auto"/>
+              <w:jc w:val="left"/>
+            </w:pPr>
+            <w:r>
+              <w:rPr>
+                <w:rFonts w:ascii="Malgun Gothic" w:hAnsi="Malgun Gothic" w:eastAsia="Malgun Gothic" w:cs="Malgun Gothic"/>
+                <w:b w:val="0"/>
+                <w:i w:val="0"/>
+                <w:color w:val="000000"/>
+                <w:sz w:val="20"/>
+              </w:rPr>
+            </w:r>
+            <w:r>
+              <w:rPr>
+                <w:rFonts w:ascii="Malgun Gothic" w:hAnsi="Malgun Gothic" w:eastAsia="Malgun Gothic" w:cs="Malgun Gothic"/>
+                <w:b w:val="0"/>
+                <w:i w:val="0"/>
+                <w:color w:val="000000"/>
+                <w:sz w:val="20"/>
+              </w:rPr>
+              <w:t>L2/mass는 개선되나 FNR이 높음</w:t>
+            </w:r>
+          </w:p>
+        </w:tc>
+        <w:tc>
+          <w:tcPr>
+            <w:tcW w:type="dxa" w:w="3528"/>
+            <w:vAlign w:val="center"/>
+          </w:tcPr>
+          <w:p>
+            <w:pPr>
+              <w:spacing w:before="0" w:after="0" w:line="240" w:lineRule="auto"/>
+              <w:jc w:val="left"/>
+            </w:pPr>
+            <w:r>
+              <w:rPr>
+                <w:rFonts w:ascii="Malgun Gothic" w:hAnsi="Malgun Gothic" w:eastAsia="Malgun Gothic" w:cs="Malgun Gothic"/>
+                <w:b w:val="0"/>
+                <w:i w:val="0"/>
+                <w:color w:val="000000"/>
+                <w:sz w:val="20"/>
+              </w:rPr>
+            </w:r>
+            <w:r>
+              <w:rPr>
+                <w:rFonts w:ascii="Malgun Gothic" w:hAnsi="Malgun Gothic" w:eastAsia="Malgun Gothic" w:cs="Malgun Gothic"/>
+                <w:b w:val="0"/>
+                <w:i w:val="0"/>
+                <w:color w:val="000000"/>
+                <w:sz w:val="20"/>
+              </w:rPr>
+              <w:t>korea_error_baselines.gif, support metrics</w:t>
+            </w:r>
+          </w:p>
+        </w:tc>
+      </w:tr>
+    </w:tbl>
+    <w:p>
+      <w:pPr>
+        <w:spacing w:before="0" w:after="80" w:line="252" w:lineRule="auto"/>
+      </w:pPr>
+    </w:p>
+    <w:p>
+      <w:r>
+        <w:rPr>
+          <w:rFonts w:ascii="Malgun Gothic" w:hAnsi="Malgun Gothic" w:eastAsia="Malgun Gothic" w:cs="Malgun Gothic"/>
+          <w:b w:val="0"/>
+          <w:i w:val="0"/>
+          <w:color w:val="000000"/>
+          <w:sz w:val="20"/>
+        </w:rPr>
+        <w:br w:type="page"/>
+      </w:r>
+    </w:p>
+    <w:p>
+      <w:pPr>
+        <w:pStyle w:val="Heading1"/>
+        <w:spacing w:before="80" w:after="80" w:line="252" w:lineRule="auto"/>
+      </w:pPr>
+      <w:r>
+        <w:rPr>
+          <w:rFonts w:ascii="Malgun Gothic" w:hAnsi="Malgun Gothic" w:eastAsia="Malgun Gothic" w:cs="Malgun Gothic"/>
+          <w:b/>
+          <w:i w:val="0"/>
+          <w:color w:val="000000"/>
+          <w:sz w:val="20"/>
+        </w:rPr>
+        <w:t>7. 해결 방안의 구현 반영</w:t>
+      </w:r>
+    </w:p>
+    <w:p>
+      <w:pPr>
+        <w:spacing w:before="0" w:after="80" w:line="252" w:lineRule="auto"/>
+      </w:pPr>
+      <w:r>
+        <w:rPr>
+          <w:rFonts w:ascii="Malgun Gothic" w:hAnsi="Malgun Gothic" w:eastAsia="Malgun Gothic" w:cs="Malgun Gothic"/>
+          <w:b w:val="0"/>
+          <w:i w:val="0"/>
+          <w:color w:val="000000"/>
+          <w:sz w:val="20"/>
+        </w:rPr>
+        <w:t>해결 방안은 loss를 단순히 늘리는 방식이 아니라, 실패 모드와 직접 연결되는 제약을 추가하는 방식으로 구성했다. known initial condition과 hard IC는 초기장 붕괴를 막고, level-set/profile/support loss는 front 위치와 두께를 직접 제어한다. mass floor와 mass trajectory는 all-zero collapse를 막으며, coefficient anchor와 spatial coefficient regularization은 D/r 학습의 식별성을 안정화한다.</w:t>
+      </w:r>
+    </w:p>
+    <w:p>
+      <w:pPr>
+        <w:spacing w:before="0" w:after="80" w:line="252" w:lineRule="auto"/>
+      </w:pPr>
+      <w:r>
+        <w:rPr>
+          <w:rFonts w:ascii="Malgun Gothic" w:hAnsi="Malgun Gothic" w:eastAsia="Malgun Gothic" w:cs="Malgun Gothic"/>
+          <w:b w:val="0"/>
+          <w:i w:val="0"/>
+          <w:color w:val="000000"/>
+          <w:sz w:val="20"/>
+        </w:rPr>
+        <w:t>checkpoint 수정은 학습 결과 해석에서 가장 중요한 절차 개선이다. 기존 validation MSE 단독 기준은 sparse observation 환경에서 초기 모델을 과대평가할 수 있었다. 새 기준은 validation MSE, late-time RK4 teacher proxy, PDE residual, IC, front proxy, mass proxy를 log-scale composite score로 합산하고, 최소 epoch 이후의 모델만 checkpoint 후보로 삼는다.</w:t>
+      </w:r>
+    </w:p>
+    <w:p>
+      <w:pPr>
+        <w:spacing w:before="0" w:after="80" w:line="252" w:lineRule="auto"/>
+      </w:pPr>
+      <w:r>
+        <w:rPr>
+          <w:rFonts w:ascii="Malgun Gothic" w:hAnsi="Malgun Gothic" w:eastAsia="Malgun Gothic" w:cs="Malgun Gothic"/>
+          <w:b w:val="0"/>
+          <w:i w:val="0"/>
+          <w:color w:val="000000"/>
+          <w:sz w:val="20"/>
+        </w:rPr>
+        <w:t>time marching과 time-slab curriculum은 parabolic PDE에서 초반 시간 오차가 후반 front 전체로 전파되는 문제를 줄이기 위한 장치다. 전체 시간 구간을 한 번에 강제하지 않고, 초기장과 쉬운 시간 구간을 먼저 안정화한 뒤 후반 front를 학습한다. front-aware RAR는 residual이 큰 영역뿐 아니라 u(1-u)와 gradient가 큰 active front 주변 collocation을 보강한다.</w:t>
+      </w:r>
+    </w:p>
+    <w:p>
+      <w:pPr>
+        <w:spacing w:before="0" w:after="80" w:line="252" w:lineRule="auto"/>
+      </w:pPr>
+      <w:r>
+        <w:rPr>
+          <w:rFonts w:ascii="Malgun Gothic" w:hAnsi="Malgun Gothic" w:eastAsia="Malgun Gothic" w:cs="Malgun Gothic"/>
+          <w:b w:val="0"/>
+          <w:i w:val="0"/>
+          <w:color w:val="000000"/>
+          <w:sz w:val="20"/>
+        </w:rPr>
+        <w:t>산림청 코드에서는 물리 제약을 지도 도메인에 맞게 바꿨다. 바다는 diffusion이 일어날 수 없는 영역으로 처리하고, RK4는 masked no-flux diffusion을 사용하며, PINN은 land-only collocation과 sea exclusion penalty를 사용한다. raw CSV가 있을 때는 조치 시작 전 월별 시간축을 구성해 방제 이후 동역학과 자연 확산 동역학을 섞지 않도록 한다.</w:t>
+      </w:r>
+    </w:p>
+    <w:tbl>
+      <w:tblGrid>
+        <w:gridCol w:w="2520"/>
+        <w:gridCol w:w="4608"/>
+        <w:gridCol w:w="3312"/>
+      </w:tblGrid>
+      <w:tblPr>
+        <w:tblStyle w:val="TableGrid"/>
+        <w:tblW w:type="dxa" w:w="10440"/>
+        <w:jc w:val="center"/>
+        <w:tblLayout w:type="fixed"/>
+        <w:tblLook w:firstColumn="1" w:firstRow="1" w:lastColumn="0" w:lastRow="0" w:noHBand="0" w:noVBand="1" w:val="04A0"/>
+        <w:tblCellMar>
+          <w:top w:w="90" w:type="dxa"/>
+          <w:bottom w:w="90" w:type="dxa"/>
+          <w:left w:w="140" w:type="dxa"/>
+          <w:right w:w="140" w:type="dxa"/>
+          <w:start w:w="140" w:type="dxa"/>
+          <w:end w:w="140" w:type="dxa"/>
+        </w:tblCellMar>
+        <w:tblInd w:type="dxa" w:w="0"/>
+      </w:tblPr>
+      <w:tr>
+        <w:tc>
+          <w:tcPr>
+            <w:tcW w:type="dxa" w:w="2520"/>
+            <w:vAlign w:val="center"/>
+          </w:tcPr>
+          <w:p>
+            <w:pPr>
+              <w:spacing w:before="0" w:after="0" w:line="240" w:lineRule="auto"/>
+              <w:jc w:val="center"/>
+            </w:pPr>
+            <w:r>
+              <w:rPr>
+                <w:rFonts w:ascii="Malgun Gothic" w:hAnsi="Malgun Gothic" w:eastAsia="Malgun Gothic" w:cs="Malgun Gothic"/>
+                <w:b w:val="0"/>
+                <w:i w:val="0"/>
+                <w:color w:val="000000"/>
+                <w:sz w:val="20"/>
+              </w:rPr>
+            </w:r>
+            <w:r>
+              <w:rPr>
+                <w:rFonts w:ascii="Malgun Gothic" w:hAnsi="Malgun Gothic" w:eastAsia="Malgun Gothic" w:cs="Malgun Gothic"/>
+                <w:b/>
+                <w:i w:val="0"/>
+                <w:color w:val="000000"/>
+                <w:sz w:val="20"/>
+              </w:rPr>
+              <w:t>해결 장치</w:t>
+            </w:r>
+          </w:p>
+        </w:tc>
+        <w:tc>
+          <w:tcPr>
+            <w:tcW w:type="dxa" w:w="4608"/>
+            <w:vAlign w:val="center"/>
+          </w:tcPr>
+          <w:p>
+            <w:pPr>
+              <w:spacing w:before="0" w:after="0" w:line="240" w:lineRule="auto"/>
+              <w:jc w:val="center"/>
+            </w:pPr>
+            <w:r>
+              <w:rPr>
+                <w:rFonts w:ascii="Malgun Gothic" w:hAnsi="Malgun Gothic" w:eastAsia="Malgun Gothic" w:cs="Malgun Gothic"/>
+                <w:b w:val="0"/>
+                <w:i w:val="0"/>
+                <w:color w:val="000000"/>
+                <w:sz w:val="20"/>
+              </w:rPr>
+            </w:r>
+            <w:r>
+              <w:rPr>
+                <w:rFonts w:ascii="Malgun Gothic" w:hAnsi="Malgun Gothic" w:eastAsia="Malgun Gothic" w:cs="Malgun Gothic"/>
+                <w:b/>
+                <w:i w:val="0"/>
+                <w:color w:val="000000"/>
+                <w:sz w:val="20"/>
+              </w:rPr>
+              <w:t>코드 반영</w:t>
+            </w:r>
+          </w:p>
+        </w:tc>
+        <w:tc>
+          <w:tcPr>
+            <w:tcW w:type="dxa" w:w="3312"/>
+            <w:vAlign w:val="center"/>
+          </w:tcPr>
+          <w:p>
+            <w:pPr>
+              <w:spacing w:before="0" w:after="0" w:line="240" w:lineRule="auto"/>
+              <w:jc w:val="center"/>
+            </w:pPr>
+            <w:r>
+              <w:rPr>
+                <w:rFonts w:ascii="Malgun Gothic" w:hAnsi="Malgun Gothic" w:eastAsia="Malgun Gothic" w:cs="Malgun Gothic"/>
+                <w:b w:val="0"/>
+                <w:i w:val="0"/>
+                <w:color w:val="000000"/>
+                <w:sz w:val="20"/>
+              </w:rPr>
+            </w:r>
+            <w:r>
+              <w:rPr>
+                <w:rFonts w:ascii="Malgun Gothic" w:hAnsi="Malgun Gothic" w:eastAsia="Malgun Gothic" w:cs="Malgun Gothic"/>
+                <w:b/>
+                <w:i w:val="0"/>
+                <w:color w:val="000000"/>
+                <w:sz w:val="20"/>
+              </w:rPr>
+              <w:t>목적</w:t>
+            </w:r>
+          </w:p>
+        </w:tc>
+      </w:tr>
+      <w:tr>
+        <w:tc>
+          <w:tcPr>
+            <w:tcW w:type="dxa" w:w="2520"/>
+            <w:vAlign w:val="center"/>
+          </w:tcPr>
+          <w:p>
+            <w:pPr>
+              <w:spacing w:before="0" w:after="0" w:line="240" w:lineRule="auto"/>
+              <w:jc w:val="left"/>
+            </w:pPr>
+            <w:r>
+              <w:rPr>
+                <w:rFonts w:ascii="Malgun Gothic" w:hAnsi="Malgun Gothic" w:eastAsia="Malgun Gothic" w:cs="Malgun Gothic"/>
+                <w:b w:val="0"/>
+                <w:i w:val="0"/>
+                <w:color w:val="000000"/>
+                <w:sz w:val="20"/>
+              </w:rPr>
+            </w:r>
+            <w:r>
+              <w:rPr>
+                <w:rFonts w:ascii="Malgun Gothic" w:hAnsi="Malgun Gothic" w:eastAsia="Malgun Gothic" w:cs="Malgun Gothic"/>
+                <w:b w:val="0"/>
+                <w:i w:val="0"/>
+                <w:color w:val="000000"/>
+                <w:sz w:val="20"/>
+              </w:rPr>
+              <w:t>Composite checkpoint</w:t>
+            </w:r>
+          </w:p>
+        </w:tc>
+        <w:tc>
+          <w:tcPr>
+            <w:tcW w:type="dxa" w:w="4608"/>
+            <w:vAlign w:val="center"/>
+          </w:tcPr>
+          <w:p>
+            <w:pPr>
+              <w:spacing w:before="0" w:after="0" w:line="240" w:lineRule="auto"/>
+              <w:jc w:val="left"/>
+            </w:pPr>
+            <w:r>
+              <w:rPr>
+                <w:rFonts w:ascii="Malgun Gothic" w:hAnsi="Malgun Gothic" w:eastAsia="Malgun Gothic" w:cs="Malgun Gothic"/>
+                <w:b w:val="0"/>
+                <w:i w:val="0"/>
+                <w:color w:val="000000"/>
+                <w:sz w:val="20"/>
+              </w:rPr>
+            </w:r>
+            <w:r>
+              <w:rPr>
+                <w:rFonts w:ascii="Malgun Gothic" w:hAnsi="Malgun Gothic" w:eastAsia="Malgun Gothic" w:cs="Malgun Gothic"/>
+                <w:b w:val="0"/>
+                <w:i w:val="0"/>
+                <w:color w:val="000000"/>
+                <w:sz w:val="20"/>
+              </w:rPr>
+              <w:t>TrainConfig checkpoint weights, train.py score helper</w:t>
+            </w:r>
+          </w:p>
+        </w:tc>
+        <w:tc>
+          <w:tcPr>
+            <w:tcW w:type="dxa" w:w="3312"/>
+            <w:vAlign w:val="center"/>
+          </w:tcPr>
+          <w:p>
+            <w:pPr>
+              <w:spacing w:before="0" w:after="0" w:line="240" w:lineRule="auto"/>
+              <w:jc w:val="left"/>
+            </w:pPr>
+            <w:r>
+              <w:rPr>
+                <w:rFonts w:ascii="Malgun Gothic" w:hAnsi="Malgun Gothic" w:eastAsia="Malgun Gothic" w:cs="Malgun Gothic"/>
+                <w:b w:val="0"/>
+                <w:i w:val="0"/>
+                <w:color w:val="000000"/>
+                <w:sz w:val="20"/>
+              </w:rPr>
+            </w:r>
+            <w:r>
+              <w:rPr>
+                <w:rFonts w:ascii="Malgun Gothic" w:hAnsi="Malgun Gothic" w:eastAsia="Malgun Gothic" w:cs="Malgun Gothic"/>
+                <w:b w:val="0"/>
+                <w:i w:val="0"/>
+                <w:color w:val="000000"/>
+                <w:sz w:val="20"/>
+              </w:rPr>
+              <w:t>관측점 MSE 단독 선택 방지</w:t>
+            </w:r>
+          </w:p>
+        </w:tc>
+      </w:tr>
+      <w:tr>
+        <w:tc>
+          <w:tcPr>
+            <w:tcW w:type="dxa" w:w="2520"/>
+            <w:vAlign w:val="center"/>
+          </w:tcPr>
+          <w:p>
+            <w:pPr>
+              <w:spacing w:before="0" w:after="0" w:line="240" w:lineRule="auto"/>
+              <w:jc w:val="left"/>
+            </w:pPr>
+            <w:r>
+              <w:rPr>
+                <w:rFonts w:ascii="Malgun Gothic" w:hAnsi="Malgun Gothic" w:eastAsia="Malgun Gothic" w:cs="Malgun Gothic"/>
+                <w:b w:val="0"/>
+                <w:i w:val="0"/>
+                <w:color w:val="000000"/>
+                <w:sz w:val="20"/>
+              </w:rPr>
+            </w:r>
+            <w:r>
+              <w:rPr>
+                <w:rFonts w:ascii="Malgun Gothic" w:hAnsi="Malgun Gothic" w:eastAsia="Malgun Gothic" w:cs="Malgun Gothic"/>
+                <w:b w:val="0"/>
+                <w:i w:val="0"/>
+                <w:color w:val="000000"/>
+                <w:sz w:val="20"/>
+              </w:rPr>
+              <w:t>Known IC / hard IC</w:t>
+            </w:r>
+          </w:p>
+        </w:tc>
+        <w:tc>
+          <w:tcPr>
+            <w:tcW w:type="dxa" w:w="4608"/>
+            <w:vAlign w:val="center"/>
+          </w:tcPr>
+          <w:p>
+            <w:pPr>
+              <w:spacing w:before="0" w:after="0" w:line="240" w:lineRule="auto"/>
+              <w:jc w:val="left"/>
+            </w:pPr>
+            <w:r>
+              <w:rPr>
+                <w:rFonts w:ascii="Malgun Gothic" w:hAnsi="Malgun Gothic" w:eastAsia="Malgun Gothic" w:cs="Malgun Gothic"/>
+                <w:b w:val="0"/>
+                <w:i w:val="0"/>
+                <w:color w:val="000000"/>
+                <w:sz w:val="20"/>
+              </w:rPr>
+            </w:r>
+            <w:r>
+              <w:rPr>
+                <w:rFonts w:ascii="Malgun Gothic" w:hAnsi="Malgun Gothic" w:eastAsia="Malgun Gothic" w:cs="Malgun Gothic"/>
+                <w:b w:val="0"/>
+                <w:i w:val="0"/>
+                <w:color w:val="000000"/>
+                <w:sz w:val="20"/>
+              </w:rPr>
+              <w:t>known_initial_condition_loss, hard_initial_condition</w:t>
+            </w:r>
+          </w:p>
+        </w:tc>
+        <w:tc>
+          <w:tcPr>
+            <w:tcW w:type="dxa" w:w="3312"/>
+            <w:vAlign w:val="center"/>
+          </w:tcPr>
+          <w:p>
+            <w:pPr>
+              <w:spacing w:before="0" w:after="0" w:line="240" w:lineRule="auto"/>
+              <w:jc w:val="left"/>
+            </w:pPr>
+            <w:r>
+              <w:rPr>
+                <w:rFonts w:ascii="Malgun Gothic" w:hAnsi="Malgun Gothic" w:eastAsia="Malgun Gothic" w:cs="Malgun Gothic"/>
+                <w:b w:val="0"/>
+                <w:i w:val="0"/>
+                <w:color w:val="000000"/>
+                <w:sz w:val="20"/>
+              </w:rPr>
+            </w:r>
+            <w:r>
+              <w:rPr>
+                <w:rFonts w:ascii="Malgun Gothic" w:hAnsi="Malgun Gothic" w:eastAsia="Malgun Gothic" w:cs="Malgun Gothic"/>
+                <w:b w:val="0"/>
+                <w:i w:val="0"/>
+                <w:color w:val="000000"/>
+                <w:sz w:val="20"/>
+              </w:rPr>
+              <w:t>초기부터 퍼진 haze와 collapse 억제</w:t>
+            </w:r>
+          </w:p>
+        </w:tc>
+      </w:tr>
+      <w:tr>
+        <w:tc>
+          <w:tcPr>
+            <w:tcW w:type="dxa" w:w="2520"/>
+            <w:vAlign w:val="center"/>
+          </w:tcPr>
+          <w:p>
+            <w:pPr>
+              <w:spacing w:before="0" w:after="0" w:line="240" w:lineRule="auto"/>
+              <w:jc w:val="left"/>
+            </w:pPr>
+            <w:r>
+              <w:rPr>
+                <w:rFonts w:ascii="Malgun Gothic" w:hAnsi="Malgun Gothic" w:eastAsia="Malgun Gothic" w:cs="Malgun Gothic"/>
+                <w:b w:val="0"/>
+                <w:i w:val="0"/>
+                <w:color w:val="000000"/>
+                <w:sz w:val="20"/>
+              </w:rPr>
+            </w:r>
+            <w:r>
+              <w:rPr>
+                <w:rFonts w:ascii="Malgun Gothic" w:hAnsi="Malgun Gothic" w:eastAsia="Malgun Gothic" w:cs="Malgun Gothic"/>
+                <w:b w:val="0"/>
+                <w:i w:val="0"/>
+                <w:color w:val="000000"/>
+                <w:sz w:val="20"/>
+              </w:rPr>
+              <w:t>Level-set/profile loss</w:t>
+            </w:r>
+          </w:p>
+        </w:tc>
+        <w:tc>
+          <w:tcPr>
+            <w:tcW w:type="dxa" w:w="4608"/>
+            <w:vAlign w:val="center"/>
+          </w:tcPr>
+          <w:p>
+            <w:pPr>
+              <w:spacing w:before="0" w:after="0" w:line="240" w:lineRule="auto"/>
+              <w:jc w:val="left"/>
+            </w:pPr>
+            <w:r>
+              <w:rPr>
+                <w:rFonts w:ascii="Malgun Gothic" w:hAnsi="Malgun Gothic" w:eastAsia="Malgun Gothic" w:cs="Malgun Gothic"/>
+                <w:b w:val="0"/>
+                <w:i w:val="0"/>
+                <w:color w:val="000000"/>
+                <w:sz w:val="20"/>
+              </w:rPr>
+            </w:r>
+            <w:r>
+              <w:rPr>
+                <w:rFonts w:ascii="Malgun Gothic" w:hAnsi="Malgun Gothic" w:eastAsia="Malgun Gothic" w:cs="Malgun Gothic"/>
+                <w:b w:val="0"/>
+                <w:i w:val="0"/>
+                <w:color w:val="000000"/>
+                <w:sz w:val="20"/>
+              </w:rPr>
+              <w:t>front_level_set_alignment_loss, front_profile_alignment_loss</w:t>
+            </w:r>
+          </w:p>
+        </w:tc>
+        <w:tc>
+          <w:tcPr>
+            <w:tcW w:type="dxa" w:w="3312"/>
+            <w:vAlign w:val="center"/>
+          </w:tcPr>
+          <w:p>
+            <w:pPr>
+              <w:spacing w:before="0" w:after="0" w:line="240" w:lineRule="auto"/>
+              <w:jc w:val="left"/>
+            </w:pPr>
+            <w:r>
+              <w:rPr>
+                <w:rFonts w:ascii="Malgun Gothic" w:hAnsi="Malgun Gothic" w:eastAsia="Malgun Gothic" w:cs="Malgun Gothic"/>
+                <w:b w:val="0"/>
+                <w:i w:val="0"/>
+                <w:color w:val="000000"/>
+                <w:sz w:val="20"/>
+              </w:rPr>
+            </w:r>
+            <w:r>
+              <w:rPr>
+                <w:rFonts w:ascii="Malgun Gothic" w:hAnsi="Malgun Gothic" w:eastAsia="Malgun Gothic" w:cs="Malgun Gothic"/>
+                <w:b w:val="0"/>
+                <w:i w:val="0"/>
+                <w:color w:val="000000"/>
+                <w:sz w:val="20"/>
+              </w:rPr>
+              <w:t>front phase, level, slope 정렬</w:t>
+            </w:r>
+          </w:p>
+        </w:tc>
+      </w:tr>
+      <w:tr>
+        <w:tc>
+          <w:tcPr>
+            <w:tcW w:type="dxa" w:w="2520"/>
+            <w:vAlign w:val="center"/>
+          </w:tcPr>
+          <w:p>
+            <w:pPr>
+              <w:spacing w:before="0" w:after="0" w:line="240" w:lineRule="auto"/>
+              <w:jc w:val="left"/>
+            </w:pPr>
+            <w:r>
+              <w:rPr>
+                <w:rFonts w:ascii="Malgun Gothic" w:hAnsi="Malgun Gothic" w:eastAsia="Malgun Gothic" w:cs="Malgun Gothic"/>
+                <w:b w:val="0"/>
+                <w:i w:val="0"/>
+                <w:color w:val="000000"/>
+                <w:sz w:val="20"/>
+              </w:rPr>
+            </w:r>
+            <w:r>
+              <w:rPr>
+                <w:rFonts w:ascii="Malgun Gothic" w:hAnsi="Malgun Gothic" w:eastAsia="Malgun Gothic" w:cs="Malgun Gothic"/>
+                <w:b w:val="0"/>
+                <w:i w:val="0"/>
+                <w:color w:val="000000"/>
+                <w:sz w:val="20"/>
+              </w:rPr>
+              <w:t>Support Tversky</w:t>
+            </w:r>
+          </w:p>
+        </w:tc>
+        <w:tc>
+          <w:tcPr>
+            <w:tcW w:type="dxa" w:w="4608"/>
+            <w:vAlign w:val="center"/>
+          </w:tcPr>
+          <w:p>
+            <w:pPr>
+              <w:spacing w:before="0" w:after="0" w:line="240" w:lineRule="auto"/>
+              <w:jc w:val="left"/>
+            </w:pPr>
+            <w:r>
+              <w:rPr>
+                <w:rFonts w:ascii="Malgun Gothic" w:hAnsi="Malgun Gothic" w:eastAsia="Malgun Gothic" w:cs="Malgun Gothic"/>
+                <w:b w:val="0"/>
+                <w:i w:val="0"/>
+                <w:color w:val="000000"/>
+                <w:sz w:val="20"/>
+              </w:rPr>
+            </w:r>
+            <w:r>
+              <w:rPr>
+                <w:rFonts w:ascii="Malgun Gothic" w:hAnsi="Malgun Gothic" w:eastAsia="Malgun Gothic" w:cs="Malgun Gothic"/>
+                <w:b w:val="0"/>
+                <w:i w:val="0"/>
+                <w:color w:val="000000"/>
+                <w:sz w:val="20"/>
+              </w:rPr>
+              <w:t>front_support_tversky_loss</w:t>
+            </w:r>
+          </w:p>
+        </w:tc>
+        <w:tc>
+          <w:tcPr>
+            <w:tcW w:type="dxa" w:w="3312"/>
+            <w:vAlign w:val="center"/>
+          </w:tcPr>
+          <w:p>
+            <w:pPr>
+              <w:spacing w:before="0" w:after="0" w:line="240" w:lineRule="auto"/>
+              <w:jc w:val="left"/>
+            </w:pPr>
+            <w:r>
+              <w:rPr>
+                <w:rFonts w:ascii="Malgun Gothic" w:hAnsi="Malgun Gothic" w:eastAsia="Malgun Gothic" w:cs="Malgun Gothic"/>
+                <w:b w:val="0"/>
+                <w:i w:val="0"/>
+                <w:color w:val="000000"/>
+                <w:sz w:val="20"/>
+              </w:rPr>
+            </w:r>
+            <w:r>
+              <w:rPr>
+                <w:rFonts w:ascii="Malgun Gothic" w:hAnsi="Malgun Gothic" w:eastAsia="Malgun Gothic" w:cs="Malgun Gothic"/>
+                <w:b w:val="0"/>
+                <w:i w:val="0"/>
+                <w:color w:val="000000"/>
+                <w:sz w:val="20"/>
+              </w:rPr>
+              <w:t>false negative support 누락 감소</w:t>
+            </w:r>
+          </w:p>
+        </w:tc>
+      </w:tr>
+      <w:tr>
+        <w:tc>
+          <w:tcPr>
+            <w:tcW w:type="dxa" w:w="2520"/>
+            <w:vAlign w:val="center"/>
+          </w:tcPr>
+          <w:p>
+            <w:pPr>
+              <w:spacing w:before="0" w:after="0" w:line="240" w:lineRule="auto"/>
+              <w:jc w:val="left"/>
+            </w:pPr>
+            <w:r>
+              <w:rPr>
+                <w:rFonts w:ascii="Malgun Gothic" w:hAnsi="Malgun Gothic" w:eastAsia="Malgun Gothic" w:cs="Malgun Gothic"/>
+                <w:b w:val="0"/>
+                <w:i w:val="0"/>
+                <w:color w:val="000000"/>
+                <w:sz w:val="20"/>
+              </w:rPr>
+            </w:r>
+            <w:r>
+              <w:rPr>
+                <w:rFonts w:ascii="Malgun Gothic" w:hAnsi="Malgun Gothic" w:eastAsia="Malgun Gothic" w:cs="Malgun Gothic"/>
+                <w:b w:val="0"/>
+                <w:i w:val="0"/>
+                <w:color w:val="000000"/>
+                <w:sz w:val="20"/>
+              </w:rPr>
+              <w:t>Mass guards</w:t>
+            </w:r>
+          </w:p>
+        </w:tc>
+        <w:tc>
+          <w:tcPr>
+            <w:tcW w:type="dxa" w:w="4608"/>
+            <w:vAlign w:val="center"/>
+          </w:tcPr>
+          <w:p>
+            <w:pPr>
+              <w:spacing w:before="0" w:after="0" w:line="240" w:lineRule="auto"/>
+              <w:jc w:val="left"/>
+            </w:pPr>
+            <w:r>
+              <w:rPr>
+                <w:rFonts w:ascii="Malgun Gothic" w:hAnsi="Malgun Gothic" w:eastAsia="Malgun Gothic" w:cs="Malgun Gothic"/>
+                <w:b w:val="0"/>
+                <w:i w:val="0"/>
+                <w:color w:val="000000"/>
+                <w:sz w:val="20"/>
+              </w:rPr>
+            </w:r>
+            <w:r>
+              <w:rPr>
+                <w:rFonts w:ascii="Malgun Gothic" w:hAnsi="Malgun Gothic" w:eastAsia="Malgun Gothic" w:cs="Malgun Gothic"/>
+                <w:b w:val="0"/>
+                <w:i w:val="0"/>
+                <w:color w:val="000000"/>
+                <w:sz w:val="20"/>
+              </w:rPr>
+              <w:t>mass_floor_trajectory_loss, parabolic_mass_balance_loss</w:t>
+            </w:r>
+          </w:p>
+        </w:tc>
+        <w:tc>
+          <w:tcPr>
+            <w:tcW w:type="dxa" w:w="3312"/>
+            <w:vAlign w:val="center"/>
+          </w:tcPr>
+          <w:p>
+            <w:pPr>
+              <w:spacing w:before="0" w:after="0" w:line="240" w:lineRule="auto"/>
+              <w:jc w:val="left"/>
+            </w:pPr>
+            <w:r>
+              <w:rPr>
+                <w:rFonts w:ascii="Malgun Gothic" w:hAnsi="Malgun Gothic" w:eastAsia="Malgun Gothic" w:cs="Malgun Gothic"/>
+                <w:b w:val="0"/>
+                <w:i w:val="0"/>
+                <w:color w:val="000000"/>
+                <w:sz w:val="20"/>
+              </w:rPr>
+            </w:r>
+            <w:r>
+              <w:rPr>
+                <w:rFonts w:ascii="Malgun Gothic" w:hAnsi="Malgun Gothic" w:eastAsia="Malgun Gothic" w:cs="Malgun Gothic"/>
+                <w:b w:val="0"/>
+                <w:i w:val="0"/>
+                <w:color w:val="000000"/>
+                <w:sz w:val="20"/>
+              </w:rPr>
+              <w:t>감염 총량 보존과 all-zero 방지</w:t>
+            </w:r>
+          </w:p>
+        </w:tc>
+      </w:tr>
+      <w:tr>
+        <w:tc>
+          <w:tcPr>
+            <w:tcW w:type="dxa" w:w="2520"/>
+            <w:vAlign w:val="center"/>
+          </w:tcPr>
+          <w:p>
+            <w:pPr>
+              <w:spacing w:before="0" w:after="0" w:line="240" w:lineRule="auto"/>
+              <w:jc w:val="left"/>
+            </w:pPr>
+            <w:r>
+              <w:rPr>
+                <w:rFonts w:ascii="Malgun Gothic" w:hAnsi="Malgun Gothic" w:eastAsia="Malgun Gothic" w:cs="Malgun Gothic"/>
+                <w:b w:val="0"/>
+                <w:i w:val="0"/>
+                <w:color w:val="000000"/>
+                <w:sz w:val="20"/>
+              </w:rPr>
+            </w:r>
+            <w:r>
+              <w:rPr>
+                <w:rFonts w:ascii="Malgun Gothic" w:hAnsi="Malgun Gothic" w:eastAsia="Malgun Gothic" w:cs="Malgun Gothic"/>
+                <w:b w:val="0"/>
+                <w:i w:val="0"/>
+                <w:color w:val="000000"/>
+                <w:sz w:val="20"/>
+              </w:rPr>
+              <w:t>Weak RK4 teacher</w:t>
+            </w:r>
+          </w:p>
+        </w:tc>
+        <w:tc>
+          <w:tcPr>
+            <w:tcW w:type="dxa" w:w="4608"/>
+            <w:vAlign w:val="center"/>
+          </w:tcPr>
+          <w:p>
+            <w:pPr>
+              <w:spacing w:before="0" w:after="0" w:line="240" w:lineRule="auto"/>
+              <w:jc w:val="left"/>
+            </w:pPr>
+            <w:r>
+              <w:rPr>
+                <w:rFonts w:ascii="Malgun Gothic" w:hAnsi="Malgun Gothic" w:eastAsia="Malgun Gothic" w:cs="Malgun Gothic"/>
+                <w:b w:val="0"/>
+                <w:i w:val="0"/>
+                <w:color w:val="000000"/>
+                <w:sz w:val="20"/>
+              </w:rPr>
+            </w:r>
+            <w:r>
+              <w:rPr>
+                <w:rFonts w:ascii="Malgun Gothic" w:hAnsi="Malgun Gothic" w:eastAsia="Malgun Gothic" w:cs="Malgun Gothic"/>
+                <w:b w:val="0"/>
+                <w:i w:val="0"/>
+                <w:color w:val="000000"/>
+                <w:sz w:val="20"/>
+              </w:rPr>
+              <w:t>rk4_pretrain, rk4_teacher proxy</w:t>
+            </w:r>
+          </w:p>
+        </w:tc>
+        <w:tc>
+          <w:tcPr>
+            <w:tcW w:type="dxa" w:w="3312"/>
+            <w:vAlign w:val="center"/>
+          </w:tcPr>
+          <w:p>
+            <w:pPr>
+              <w:spacing w:before="0" w:after="0" w:line="240" w:lineRule="auto"/>
+              <w:jc w:val="left"/>
+            </w:pPr>
+            <w:r>
+              <w:rPr>
+                <w:rFonts w:ascii="Malgun Gothic" w:hAnsi="Malgun Gothic" w:eastAsia="Malgun Gothic" w:cs="Malgun Gothic"/>
+                <w:b w:val="0"/>
+                <w:i w:val="0"/>
+                <w:color w:val="000000"/>
+                <w:sz w:val="20"/>
+              </w:rPr>
+            </w:r>
+            <w:r>
+              <w:rPr>
+                <w:rFonts w:ascii="Malgun Gothic" w:hAnsi="Malgun Gothic" w:eastAsia="Malgun Gothic" w:cs="Malgun Gothic"/>
+                <w:b w:val="0"/>
+                <w:i w:val="0"/>
+                <w:color w:val="000000"/>
+                <w:sz w:val="20"/>
+              </w:rPr>
+              <w:t>초기 최적화와 late front 안정화</w:t>
+            </w:r>
+          </w:p>
+        </w:tc>
+      </w:tr>
+      <w:tr>
+        <w:tc>
+          <w:tcPr>
+            <w:tcW w:type="dxa" w:w="2520"/>
+            <w:vAlign w:val="center"/>
+          </w:tcPr>
+          <w:p>
+            <w:pPr>
+              <w:spacing w:before="0" w:after="0" w:line="240" w:lineRule="auto"/>
+              <w:jc w:val="left"/>
+            </w:pPr>
+            <w:r>
+              <w:rPr>
+                <w:rFonts w:ascii="Malgun Gothic" w:hAnsi="Malgun Gothic" w:eastAsia="Malgun Gothic" w:cs="Malgun Gothic"/>
+                <w:b w:val="0"/>
+                <w:i w:val="0"/>
+                <w:color w:val="000000"/>
+                <w:sz w:val="20"/>
+              </w:rPr>
+            </w:r>
+            <w:r>
+              <w:rPr>
+                <w:rFonts w:ascii="Malgun Gothic" w:hAnsi="Malgun Gothic" w:eastAsia="Malgun Gothic" w:cs="Malgun Gothic"/>
+                <w:b w:val="0"/>
+                <w:i w:val="0"/>
+                <w:color w:val="000000"/>
+                <w:sz w:val="20"/>
+              </w:rPr>
+              <w:t>Land/sea constraints</w:t>
+            </w:r>
+          </w:p>
+        </w:tc>
+        <w:tc>
+          <w:tcPr>
+            <w:tcW w:type="dxa" w:w="4608"/>
+            <w:vAlign w:val="center"/>
+          </w:tcPr>
+          <w:p>
+            <w:pPr>
+              <w:spacing w:before="0" w:after="0" w:line="240" w:lineRule="auto"/>
+              <w:jc w:val="left"/>
+            </w:pPr>
+            <w:r>
+              <w:rPr>
+                <w:rFonts w:ascii="Malgun Gothic" w:hAnsi="Malgun Gothic" w:eastAsia="Malgun Gothic" w:cs="Malgun Gothic"/>
+                <w:b w:val="0"/>
+                <w:i w:val="0"/>
+                <w:color w:val="000000"/>
+                <w:sz w:val="20"/>
+              </w:rPr>
+            </w:r>
+            <w:r>
+              <w:rPr>
+                <w:rFonts w:ascii="Malgun Gothic" w:hAnsi="Malgun Gothic" w:eastAsia="Malgun Gothic" w:cs="Malgun Gothic"/>
+                <w:b w:val="0"/>
+                <w:i w:val="0"/>
+                <w:color w:val="000000"/>
+                <w:sz w:val="20"/>
+              </w:rPr>
+              <w:t>land mask, sea penalty, masked RK4</w:t>
+            </w:r>
+          </w:p>
+        </w:tc>
+        <w:tc>
+          <w:tcPr>
+            <w:tcW w:type="dxa" w:w="3312"/>
+            <w:vAlign w:val="center"/>
+          </w:tcPr>
+          <w:p>
+            <w:pPr>
+              <w:spacing w:before="0" w:after="0" w:line="240" w:lineRule="auto"/>
+              <w:jc w:val="left"/>
+            </w:pPr>
+            <w:r>
+              <w:rPr>
+                <w:rFonts w:ascii="Malgun Gothic" w:hAnsi="Malgun Gothic" w:eastAsia="Malgun Gothic" w:cs="Malgun Gothic"/>
+                <w:b w:val="0"/>
+                <w:i w:val="0"/>
+                <w:color w:val="000000"/>
+                <w:sz w:val="20"/>
+              </w:rPr>
+            </w:r>
+            <w:r>
+              <w:rPr>
+                <w:rFonts w:ascii="Malgun Gothic" w:hAnsi="Malgun Gothic" w:eastAsia="Malgun Gothic" w:cs="Malgun Gothic"/>
+                <w:b w:val="0"/>
+                <w:i w:val="0"/>
+                <w:color w:val="000000"/>
+                <w:sz w:val="20"/>
+              </w:rPr>
+              <w:t>한국 지도에서 바다 확산 금지</w:t>
+            </w:r>
+          </w:p>
+        </w:tc>
+      </w:tr>
+    </w:tbl>
+    <w:p>
+      <w:pPr>
+        <w:spacing w:before="0" w:after="80" w:line="252" w:lineRule="auto"/>
+      </w:pPr>
+    </w:p>
+    <w:p>
+      <w:r>
+        <w:rPr>
+          <w:rFonts w:ascii="Malgun Gothic" w:hAnsi="Malgun Gothic" w:eastAsia="Malgun Gothic" w:cs="Malgun Gothic"/>
+          <w:b w:val="0"/>
+          <w:i w:val="0"/>
+          <w:color w:val="000000"/>
+          <w:sz w:val="20"/>
+        </w:rPr>
+        <w:br w:type="page"/>
+      </w:r>
+    </w:p>
+    <w:p>
+      <w:pPr>
+        <w:pStyle w:val="Heading1"/>
+        <w:spacing w:before="80" w:after="80" w:line="252" w:lineRule="auto"/>
+      </w:pPr>
+      <w:r>
+        <w:rPr>
+          <w:rFonts w:ascii="Malgun Gothic" w:hAnsi="Malgun Gothic" w:eastAsia="Malgun Gothic" w:cs="Malgun Gothic"/>
+          <w:b/>
+          <w:i w:val="0"/>
+          <w:color w:val="000000"/>
+          <w:sz w:val="20"/>
+        </w:rPr>
+        <w:t>8. 한국 산림청 데이터와 문제 구성</w:t>
       </w:r>
     </w:p>
     <w:p>
@@ -2183,7 +4440,7 @@
           <w:color w:val="000000"/>
           <w:sz w:val="20"/>
         </w:rPr>
-        <w:t>7. 산림청 PINN과 D/r 해석</w:t>
+        <w:t>9. 산림청 PINN과 D/r 해석</w:t>
       </w:r>
     </w:p>
     <w:p>
@@ -2539,7 +4796,7 @@
           <w:color w:val="000000"/>
           <w:sz w:val="20"/>
         </w:rPr>
-        <w:t>8. 적용 범위와 참고문헌</w:t>
+        <w:t>10. 적용 범위와 참고문헌</w:t>
       </w:r>
     </w:p>
     <w:p>
@@ -2554,7 +4811,7 @@
           <w:color w:val="000000"/>
           <w:sz w:val="20"/>
         </w:rPr>
-        <w:t>현재 구현은 Fisher-KPP family를 중심으로 forward field, moving front, 계수 추정, land-constrained spread를 함께 다루는 기준 모델이다. 기본 synthetic 문제에서는 front-aware PINN이 moving front를 안정적으로 추적하고, 산림청 문제에서는 관측 과정과 방제 조치가 반영된 밀도장을 effective reaction-diffusion 계수로 정리한다.</w:t>
+        <w:t>현재 구현은 Fisher-KPP family를 중심으로 forward field, moving front, 계수 추정, land-constrained spread를 함께 다루는 기준 모델이다. 기본 synthetic 문제에서는 front-aware PINN이 moving front를 추적하고, 산림청 문제에서는 관측 과정과 방제 조치가 반영된 밀도장을 effective reaction-diffusion 계수로 정리한다. 산림청 계열에서 확인된 주요 문제는 바다 확산, 실제 support 누락, 연도 단위 관측의 시간 해상도 부족, 방제 조치 이후 동역학 변화다.</w:t>
       </w:r>
     </w:p>
     <w:p>
@@ -2569,7 +4826,22 @@
           <w:color w:val="000000"/>
           <w:sz w:val="20"/>
         </w:rPr>
-        <w:t>확장 방향은 multi-seed full run, 조치 시점 이후의 control term 명시화, 실제 월별 또는 일별 고해상도 관측 확보, front metric 기반 ablation의 통계 반복, D/r posterior와 uncertainty reporting이다. 현재 산출물은 validation figure, GIF, metrics JSON을 통해 field error, front error, mass trajectory, learned physics를 일관된 기준으로 확인한다.</w:t>
+        <w:t>바다 확산은 land mask, masked no-flux RK4, land-only collocation, sea exclusion penalty로 해결한다. support 누락은 false-negative weight가 큰 support Tversky와 mass trajectory로 보정하고, 과도한 false positive는 sea penalty와 support false-positive weight로 제어한다. 연도 단위 관측의 시간 해상도 부족은 raw CSV가 있을 때 pre-action monthly axis로 바꾸어 조치 시작 전 확산만 비교하는 방식으로 정리한다.</w:t>
+      </w:r>
+    </w:p>
+    <w:p>
+      <w:pPr>
+        <w:spacing w:before="0" w:after="80" w:line="252" w:lineRule="auto"/>
+      </w:pPr>
+      <w:r>
+        <w:rPr>
+          <w:rFonts w:ascii="Malgun Gothic" w:hAnsi="Malgun Gothic" w:eastAsia="Malgun Gothic" w:cs="Malgun Gothic"/>
+          <w:b w:val="0"/>
+          <w:i w:val="0"/>
+          <w:color w:val="000000"/>
+          <w:sz w:val="20"/>
+        </w:rPr>
+        <w:t>확장 방향은 multi-seed full run, 조치 시점 이후의 control term 명시화, 실제 월별 또는 일별 고해상도 관측 확보, front metric 기반 ablation의 통계 반복, D/r posterior와 uncertainty reporting이다. 현재 산출물은 validation figure, GIF, metrics JSON을 통해 field error, front error, mass trajectory, learned physics, checkpoint 선택 근거를 일관된 기준으로 확인한다.</w:t>
       </w:r>
     </w:p>
     <w:p>

</xml_diff>

<commit_message>
Add discrete RK4 consistency PINN loss
</commit_message>
<xml_diff>
--- a/docs/fisher_kpp_pinn_and_korea_pinn_technical_note.docx
+++ b/docs/fisher_kpp_pinn_and_korea_pinn_technical_note.docx
@@ -3268,6 +3268,21 @@
           <w:color w:val="000000"/>
           <w:sz w:val="20"/>
         </w:rPr>
+        <w:t>새로 추가한 discrete RK4 consistency loss는 RK4 결과장을 정답 label로 주입하지 않고, 모델이 예측한 u(t)를 Fisher-KPP PDE의 한 RK4 step으로 전개한 값과 모델의 u(t+dt)를 맞춘다. 이는 discrete-time PINN 계열의 시간 전개 제약을 차용한 것이며, 연속 AD residual만으로 약했던 moving-front phase 누적 오차를 직접 줄이기 위한 공정한 physics loss이다.</w:t>
+      </w:r>
+    </w:p>
+    <w:p>
+      <w:pPr>
+        <w:spacing w:before="0" w:after="80" w:line="252" w:lineRule="auto"/>
+      </w:pPr>
+      <w:r>
+        <w:rPr>
+          <w:rFonts w:ascii="Malgun Gothic" w:hAnsi="Malgun Gothic" w:eastAsia="Malgun Gothic" w:cs="Malgun Gothic"/>
+          <w:b w:val="0"/>
+          <w:i w:val="0"/>
+          <w:color w:val="000000"/>
+          <w:sz w:val="20"/>
+        </w:rPr>
         <w:t>산림청 코드에서는 물리 제약을 지도 도메인에 맞게 바꿨다. 바다는 diffusion이 일어날 수 없는 영역으로 처리하고, RK4는 masked no-flux diffusion을 사용하며, PINN은 land-only collocation과 sea exclusion penalty를 사용한다. raw CSV가 있을 때는 조치 시작 전 월별 시간축을 구성해 방제 이후 동역학과 자연 확산 동역학을 섞지 않도록 한다.</w:t>
       </w:r>
     </w:p>
@@ -3859,6 +3874,101 @@
                 <w:sz w:val="20"/>
               </w:rPr>
               <w:t>감염 총량 보존과 all-zero 방지</w:t>
+            </w:r>
+          </w:p>
+        </w:tc>
+      </w:tr>
+      <w:tr>
+        <w:tc>
+          <w:tcPr>
+            <w:tcW w:type="dxa" w:w="2520"/>
+            <w:vAlign w:val="center"/>
+          </w:tcPr>
+          <w:p>
+            <w:pPr>
+              <w:spacing w:before="0" w:after="0" w:line="240" w:lineRule="auto"/>
+              <w:jc w:val="left"/>
+            </w:pPr>
+            <w:r>
+              <w:rPr>
+                <w:rFonts w:ascii="Malgun Gothic" w:hAnsi="Malgun Gothic" w:eastAsia="Malgun Gothic" w:cs="Malgun Gothic"/>
+                <w:b w:val="0"/>
+                <w:i w:val="0"/>
+                <w:color w:val="000000"/>
+                <w:sz w:val="20"/>
+              </w:rPr>
+            </w:r>
+            <w:r>
+              <w:rPr>
+                <w:rFonts w:ascii="Malgun Gothic" w:hAnsi="Malgun Gothic" w:eastAsia="Malgun Gothic" w:cs="Malgun Gothic"/>
+                <w:b w:val="0"/>
+                <w:i w:val="0"/>
+                <w:color w:val="000000"/>
+                <w:sz w:val="20"/>
+              </w:rPr>
+              <w:t>Discrete RK4 consistency</w:t>
+            </w:r>
+          </w:p>
+        </w:tc>
+        <w:tc>
+          <w:tcPr>
+            <w:tcW w:type="dxa" w:w="4608"/>
+            <w:vAlign w:val="center"/>
+          </w:tcPr>
+          <w:p>
+            <w:pPr>
+              <w:spacing w:before="0" w:after="0" w:line="240" w:lineRule="auto"/>
+              <w:jc w:val="left"/>
+            </w:pPr>
+            <w:r>
+              <w:rPr>
+                <w:rFonts w:ascii="Malgun Gothic" w:hAnsi="Malgun Gothic" w:eastAsia="Malgun Gothic" w:cs="Malgun Gothic"/>
+                <w:b w:val="0"/>
+                <w:i w:val="0"/>
+                <w:color w:val="000000"/>
+                <w:sz w:val="20"/>
+              </w:rPr>
+            </w:r>
+            <w:r>
+              <w:rPr>
+                <w:rFonts w:ascii="Malgun Gothic" w:hAnsi="Malgun Gothic" w:eastAsia="Malgun Gothic" w:cs="Malgun Gothic"/>
+                <w:b w:val="0"/>
+                <w:i w:val="0"/>
+                <w:color w:val="000000"/>
+                <w:sz w:val="20"/>
+              </w:rPr>
+              <w:t>discrete_rk4_consistency_loss</w:t>
+            </w:r>
+          </w:p>
+        </w:tc>
+        <w:tc>
+          <w:tcPr>
+            <w:tcW w:type="dxa" w:w="3312"/>
+            <w:vAlign w:val="center"/>
+          </w:tcPr>
+          <w:p>
+            <w:pPr>
+              <w:spacing w:before="0" w:after="0" w:line="240" w:lineRule="auto"/>
+              <w:jc w:val="left"/>
+            </w:pPr>
+            <w:r>
+              <w:rPr>
+                <w:rFonts w:ascii="Malgun Gothic" w:hAnsi="Malgun Gothic" w:eastAsia="Malgun Gothic" w:cs="Malgun Gothic"/>
+                <w:b w:val="0"/>
+                <w:i w:val="0"/>
+                <w:color w:val="000000"/>
+                <w:sz w:val="20"/>
+              </w:rPr>
+            </w:r>
+            <w:r>
+              <w:rPr>
+                <w:rFonts w:ascii="Malgun Gothic" w:hAnsi="Malgun Gothic" w:eastAsia="Malgun Gothic" w:cs="Malgun Gothic"/>
+                <w:b w:val="0"/>
+                <w:i w:val="0"/>
+                <w:color w:val="000000"/>
+                <w:sz w:val="20"/>
+              </w:rPr>
+              <w:t>RK4 label 없이 시간 전개 일관성 강화</w:t>
             </w:r>
           </w:p>
         </w:tc>
@@ -4988,6 +5098,86 @@
         <w:t>Moseley, Ben, Andrew Markham, and Tarje Nissen-Meyer. 2023. “Finite Basis Physics-Informed Neural Networks (FBPINNs): A Scalable Domain Decomposition Approach for Solving Differential Equations.” Advances in Computational Mathematics 49: 62.</w:t>
       </w:r>
     </w:p>
+    <w:p>
+      <w:pPr>
+        <w:spacing w:before="0" w:after="60" w:line="240" w:lineRule="auto"/>
+        <w:ind w:hanging="259" w:left="259"/>
+      </w:pPr>
+      <w:r>
+        <w:rPr>
+          <w:rFonts w:ascii="Malgun Gothic" w:hAnsi="Malgun Gothic" w:eastAsia="Malgun Gothic" w:cs="Malgun Gothic"/>
+          <w:b w:val="0"/>
+          <w:i w:val="0"/>
+          <w:color w:val="000000"/>
+          <w:sz w:val="20"/>
+        </w:rPr>
+        <w:t>Yu, Jeremy, Lu Lu, Xuhui Meng, and George Em Karniadakis. 2022. “Gradient-Enhanced Physics-Informed Neural Networks for Forward and Inverse PDE Problems.” Computer Methods in Applied Mechanics and Engineering 393: 114823.</w:t>
+      </w:r>
+    </w:p>
+    <w:p>
+      <w:pPr>
+        <w:spacing w:before="0" w:after="60" w:line="240" w:lineRule="auto"/>
+        <w:ind w:hanging="259" w:left="259"/>
+      </w:pPr>
+      <w:r>
+        <w:rPr>
+          <w:rFonts w:ascii="Malgun Gothic" w:hAnsi="Malgun Gothic" w:eastAsia="Malgun Gothic" w:cs="Malgun Gothic"/>
+          <w:b w:val="0"/>
+          <w:i w:val="0"/>
+          <w:color w:val="000000"/>
+          <w:sz w:val="20"/>
+        </w:rPr>
+        <w:t>Wu, Chenxi, Min Zhu, Qinyang Tan, Yadhu Kartha, and Lu Lu. 2023. “A Comprehensive Study of Non-Adaptive and Residual-Based Adaptive Sampling for Physics-Informed Neural Networks.” Computer Methods in Applied Mechanics and Engineering 403: 115671.</w:t>
+      </w:r>
+    </w:p>
+    <w:p>
+      <w:pPr>
+        <w:spacing w:before="0" w:after="60" w:line="240" w:lineRule="auto"/>
+        <w:ind w:hanging="259" w:left="259"/>
+      </w:pPr>
+      <w:r>
+        <w:rPr>
+          <w:rFonts w:ascii="Malgun Gothic" w:hAnsi="Malgun Gothic" w:eastAsia="Malgun Gothic" w:cs="Malgun Gothic"/>
+          <w:b w:val="0"/>
+          <w:i w:val="0"/>
+          <w:color w:val="000000"/>
+          <w:sz w:val="20"/>
+        </w:rPr>
+        <w:t>Wang, Sifan, Shyam Sankaran, and Paris Perdikaris. 2024. “Respecting Causality for Training Physics-Informed Neural Networks.” Computer Methods in Applied Mechanics and Engineering 421: 116813.</w:t>
+      </w:r>
+    </w:p>
+    <w:p>
+      <w:pPr>
+        <w:spacing w:before="0" w:after="60" w:line="240" w:lineRule="auto"/>
+        <w:ind w:hanging="259" w:left="259"/>
+      </w:pPr>
+      <w:r>
+        <w:rPr>
+          <w:rFonts w:ascii="Malgun Gothic" w:hAnsi="Malgun Gothic" w:eastAsia="Malgun Gothic" w:cs="Malgun Gothic"/>
+          <w:b w:val="0"/>
+          <w:i w:val="0"/>
+          <w:color w:val="000000"/>
+          <w:sz w:val="20"/>
+        </w:rPr>
+        <w:t>Akrivis, Georgios, Charalambos G. Makridakis, and Costas Smaragdakis. 2025. “Runge-Kutta Physics-Informed Neural Networks: Formulation and Analysis.” Numerische Mathematik.</w:t>
+      </w:r>
+    </w:p>
+    <w:p>
+      <w:pPr>
+        <w:spacing w:before="0" w:after="60" w:line="240" w:lineRule="auto"/>
+        <w:ind w:hanging="259" w:left="259"/>
+      </w:pPr>
+      <w:r>
+        <w:rPr>
+          <w:rFonts w:ascii="Malgun Gothic" w:hAnsi="Malgun Gothic" w:eastAsia="Malgun Gothic" w:cs="Malgun Gothic"/>
+          <w:b w:val="0"/>
+          <w:i w:val="0"/>
+          <w:color w:val="000000"/>
+          <w:sz w:val="20"/>
+        </w:rPr>
+        <w:t>Wang, Sifan, Xinling Yu, and Paris Perdikaris. 2024. “PirateNets: Physics-Informed Deep Learning with Residual Adaptive Networks.” Journal of Machine Learning Research 25.</w:t>
+      </w:r>
+    </w:p>
     <w:sectPr>
       <w:headerReference w:type="default" r:id="rId9"/>
       <w:pgSz w:w="12240" w:h="15840"/>

</xml_diff>

<commit_message>
Align PINN backbones and tighten mass envelope
</commit_message>
<xml_diff>
--- a/docs/fisher_kpp_pinn_and_korea_pinn_technical_note.docx
+++ b/docs/fisher_kpp_pinn_and_korea_pinn_technical_note.docx
@@ -1501,7 +1501,7 @@
           <w:color w:val="000000"/>
           <w:sz w:val="20"/>
         </w:rPr>
-        <w:t>가장 최근에 확인된 직접적인 학습 절차 문제는 best checkpoint 선택 기준이었다. 기존 구현은 validation observation MSE만 기준으로 모델을 복원했기 때문에, 1200 epochs를 학습하고도 epoch 1의 낮은 관측점 MSE checkpoint가 최종 모델로 선택될 수 있었다. 이 문제는 validation MSE, late-time RK4 teacher proxy, PDE residual, known initial condition, front proxy, mass proxy를 함께 보는 composite checkpoint score와 최소 checkpoint epoch 조건으로 수정했다.</w:t>
+        <w:t>가장 최근에 확인된 직접적인 학습 절차 문제는 best checkpoint 선택 기준이었다. 기존 구현은 validation observation MSE만 기준으로 모델을 복원했기 때문에, 1200 epochs를 학습하고도 epoch 1의 낮은 관측점 MSE checkpoint가 최종 모델로 선택될 수 있었다. 이 문제는 validation MSE, late-time physics proxy, PDE residual, known initial condition, front proxy, mass proxy를 함께 보는 composite checkpoint score와 최소 checkpoint epoch 조건으로 수정했다.</w:t>
       </w:r>
     </w:p>
     <w:p>
@@ -2296,7 +2296,7 @@
                 <w:color w:val="000000"/>
                 <w:sz w:val="20"/>
               </w:rPr>
-              <w:t>RK4 reference, weak teacher, final-field/front/mass 공동 검증 적용</w:t>
+              <w:t>RK4 reference, discrete RK4 consistency, final-field/front/mass 공동 검증 적용</w:t>
             </w:r>
           </w:p>
         </w:tc>
@@ -3238,7 +3238,7 @@
           <w:color w:val="000000"/>
           <w:sz w:val="20"/>
         </w:rPr>
-        <w:t>checkpoint 수정은 학습 결과 해석에서 가장 중요한 절차 개선이다. 기존 validation MSE 단독 기준은 sparse observation 환경에서 초기 모델을 과대평가할 수 있었다. 새 기준은 validation MSE, late-time RK4 teacher proxy, PDE residual, IC, front proxy, mass proxy를 log-scale composite score로 합산하고, 최소 epoch 이후의 모델만 checkpoint 후보로 삼는다.</w:t>
+        <w:t>checkpoint 수정은 학습 결과 해석에서 가장 중요한 절차 개선이다. 기존 validation MSE 단독 기준은 sparse observation 환경에서 초기 모델을 과대평가할 수 있었다. 새 기준은 validation MSE, late-time physics proxy, PDE residual, IC, front proxy, mass proxy를 log-scale composite score로 합산하고, 최소 epoch 이후의 모델만 checkpoint 후보로 삼는다.</w:t>
       </w:r>
     </w:p>
     <w:p>
@@ -4001,7 +4001,7 @@
                 <w:color w:val="000000"/>
                 <w:sz w:val="20"/>
               </w:rPr>
-              <w:t>Weak RK4 teacher</w:t>
+              <w:t>RK4 teacher ablation</w:t>
             </w:r>
           </w:p>
         </w:tc>
@@ -4063,7 +4063,7 @@
                 <w:color w:val="000000"/>
                 <w:sz w:val="20"/>
               </w:rPr>
-              <w:t>초기 최적화와 late front 안정화</w:t>
+              <w:t>default off; 비교 및 ablation 전용</w:t>
             </w:r>
           </w:p>
         </w:tc>

</xml_diff>

<commit_message>
Add planar wave features for AZ PINN
</commit_message>
<xml_diff>
--- a/docs/fisher_kpp_pinn_and_korea_pinn_technical_note.docx
+++ b/docs/fisher_kpp_pinn_and_korea_pinn_technical_note.docx
@@ -774,7 +774,7 @@
           <w:color w:val="000000"/>
           <w:sz w:val="20"/>
         </w:rPr>
-        <w:t>기본 forward PINN은 `OriginPINN`을 사용하며 `geo_spectral_forward` 프로파일에서 architecture는 pirate, Fourier sigma는 완화된 값, random weight factorization은 켜진다. 입력은 x, y, t와 함께 seed-relative geometry, travelling-wave 좌표, front-local Fourier feature, KPP front envelope, 공간 계수장을 사용한다.</w:t>
+        <w:t>기본 forward PINN은 `OriginPINN`을 사용하며 `geo_spectral_forward` 프로파일에서 architecture는 pirate, Fourier sigma는 완화된 값, random weight factorization은 켜진다. 입력은 x, y, t와 함께 seed-relative geometry, travelling-wave 좌표, front-local Fourier feature, KPP front envelope, 공간 계수장을 사용한다. Ablowitz-Zeppetella 1D exact-wave 검증에서는 radial front 좌표 대신 평면 travelling-wave phase feature를 켠다. 이 feature는 c = 5 sqrt(D r / 6), thickness = sqrt(6D/r)에 대응하는 Fisher-KPP 특수파의 moving coordinate를 네트워크 입력으로 제공한다.</w:t>
       </w:r>
     </w:p>
     <w:p>
@@ -1501,6 +1501,21 @@
           <w:color w:val="000000"/>
           <w:sz w:val="20"/>
         </w:rPr>
+        <w:t>Ablowitz-Zeppetella 1D exact-wave 문제에서는 평면파 구조가 알려져 있으므로 planar travelling-wave phase feature를 추가했다. 40 epoch quick 검증에서 final-time relative L2는 0.4628에서 0.2243으로, validation observation MSE는 9.57e-2에서 2.13e-2로, final-time mean absolute error는 0.3574에서 0.1632로 감소했다. 이 개선은 RK4 pseudo-label이나 후보정이 아니라, 해의 알려진 travelling coordinate를 모델 입력으로 반영한 표현력 개선이다.</w:t>
+      </w:r>
+    </w:p>
+    <w:p>
+      <w:pPr>
+        <w:spacing w:before="0" w:after="80" w:line="252" w:lineRule="auto"/>
+      </w:pPr>
+      <w:r>
+        <w:rPr>
+          <w:rFonts w:ascii="Malgun Gothic" w:hAnsi="Malgun Gothic" w:eastAsia="Malgun Gothic" w:cs="Malgun Gothic"/>
+          <w:b w:val="0"/>
+          <w:i w:val="0"/>
+          <w:color w:val="000000"/>
+          <w:sz w:val="20"/>
+        </w:rPr>
         <w:t>가장 최근에 확인된 직접적인 학습 절차 문제는 best checkpoint 선택 기준이었다. 기존 구현은 validation observation MSE만 기준으로 모델을 복원했기 때문에, 1200 epochs를 학습하고도 epoch 1의 낮은 관측점 MSE checkpoint가 최종 모델로 선택될 수 있었다. 이 문제는 validation MSE, late-time physics proxy, PDE residual, known initial condition, front proxy, mass proxy를 함께 보는 composite checkpoint score와 최소 checkpoint epoch 조건으로 수정했다.</w:t>
       </w:r>
     </w:p>
@@ -2011,7 +2026,7 @@
                 <w:color w:val="000000"/>
                 <w:sz w:val="20"/>
               </w:rPr>
-              <w:t>level-set alignment, front-normal profile, time marching 적용</w:t>
+              <w:t>level-set alignment, front-normal profile, planar travelling-wave feature, time marching 적용</w:t>
             </w:r>
           </w:p>
         </w:tc>

</xml_diff>

<commit_message>
Add SciML-style moving-front comparison
</commit_message>
<xml_diff>
--- a/docs/fisher_kpp_pinn_and_korea_pinn_technical_note.docx
+++ b/docs/fisher_kpp_pinn_and_korea_pinn_technical_note.docx
@@ -774,7 +774,7 @@
           <w:color w:val="000000"/>
           <w:sz w:val="20"/>
         </w:rPr>
-        <w:t>기본 forward PINN은 `OriginPINN`을 사용하며 `geo_spectral_forward` 프로파일에서 architecture는 pirate, Fourier sigma는 완화된 값, random weight factorization은 켜진다. 입력은 x, y, t와 함께 seed-relative geometry, travelling-wave 좌표, front-local Fourier feature, KPP front envelope, 공간 계수장을 사용한다. Ablowitz-Zeppetella 1D exact-wave 검증에서는 radial front 좌표 대신 평면 travelling-wave phase feature를 켠다. 이 feature는 c = 5 sqrt(D r / 6), thickness = sqrt(6D/r)에 대응하는 Fisher-KPP 특수파의 moving coordinate를 네트워크 입력으로 제공한다.</w:t>
+        <w:t>기본 forward PINN은 `OriginPINN`을 사용하며 `geo_spectral_forward` 프로파일에서 architecture는 pirate, Fourier sigma는 완화된 값, random weight factorization은 켜진다. 입력은 x, y, t와 함께 seed-relative geometry, travelling-wave 좌표, front-local Fourier feature, KPP front envelope, 공간 계수장을 사용한다. Ablowitz-Zeppetella 1D exact-wave 검증에서는 radial front 좌표 대신 평면 travelling-wave phase feature를 켠다. 이 feature는 c = 5 sqrt(D r / 6), thickness = sqrt(6D/r)에 대응하는 Fisher-KPP 특수파의 moving coordinate를 네트워크 입력으로 제공한다. 또한 같은 2D backbone으로 1D 해를 풀 때 발생하는 인공적인 y 방향 변동을 줄이기 위해 transverse-invariance loss를 기본값으로 둔다.</w:t>
       </w:r>
     </w:p>
     <w:p>
@@ -1501,7 +1501,7 @@
           <w:color w:val="000000"/>
           <w:sz w:val="20"/>
         </w:rPr>
-        <w:t>Ablowitz-Zeppetella 1D exact-wave 문제에서는 평면파 구조가 알려져 있으므로 planar travelling-wave phase feature를 추가했다. 40 epoch quick 검증에서 final-time relative L2는 0.4628에서 0.2243으로, validation observation MSE는 9.57e-2에서 2.13e-2로, final-time mean absolute error는 0.3574에서 0.1632로 감소했다. 이 개선은 RK4 pseudo-label이나 후보정이 아니라, 해의 알려진 travelling coordinate를 모델 입력으로 반영한 표현력 개선이다.</w:t>
+        <w:t>Ablowitz-Zeppetella 1D exact-wave 문제에서는 평면파 구조가 알려져 있으므로 planar travelling-wave phase feature와 transverse-invariance loss를 추가했다. 40 epoch quick 검증에서 final-time relative L2는 0.4628에서 0.2018로, validation observation MSE는 9.57e-2에서 1.59e-2로, front-area MAE는 0.2049에서 0.0524로, mass MAE는 0.1678에서 0.0711로 감소했다. 이 개선은 RK4 pseudo-label이나 후보정이 아니라, 해의 알려진 travelling coordinate와 1D 불변성을 모델 학습 제약으로 반영한 표현력 개선이다.</w:t>
       </w:r>
     </w:p>
     <w:p>

</xml_diff>